<commit_message>
docs: update lab 2 report
</commit_message>
<xml_diff>
--- a/report/Отчет_ЛР2.docx
+++ b/report/Отчет_ЛР2.docx
@@ -297,7 +297,7 @@
       <w:r>
         <w:fldChar w:fldCharType="separate"/>
       </w:r>
-      <w:hyperlink w:anchor="_Toc242378561" w:history="1">
+      <w:hyperlink w:anchor="_Toc242385942" w:history="1">
         <w:r>
           <w:rPr>
             <w:rStyle w:val="aff8"/>
@@ -324,7 +324,7 @@
             <w:noProof/>
             <w:webHidden/>
           </w:rPr>
-          <w:instrText xml:space="preserve"> PAGEREF _Toc242378561 \h </w:instrText>
+          <w:instrText xml:space="preserve"> PAGEREF _Toc242385942 \h </w:instrText>
         </w:r>
         <w:r>
           <w:rPr>
@@ -370,7 +370,7 @@
           <w14:ligatures w14:val="standardContextual"/>
         </w:rPr>
       </w:pPr>
-      <w:hyperlink w:anchor="_Toc242378562" w:history="1">
+      <w:hyperlink w:anchor="_Toc242385943" w:history="1">
         <w:r>
           <w:rPr>
             <w:rStyle w:val="aff8"/>
@@ -397,7 +397,7 @@
             <w:noProof/>
             <w:webHidden/>
           </w:rPr>
-          <w:instrText xml:space="preserve"> PAGEREF _Toc242378562 \h </w:instrText>
+          <w:instrText xml:space="preserve"> PAGEREF _Toc242385943 \h </w:instrText>
         </w:r>
         <w:r>
           <w:rPr>
@@ -443,7 +443,7 @@
           <w14:ligatures w14:val="standardContextual"/>
         </w:rPr>
       </w:pPr>
-      <w:hyperlink w:anchor="_Toc242378563" w:history="1">
+      <w:hyperlink w:anchor="_Toc242385944" w:history="1">
         <w:r>
           <w:rPr>
             <w:rStyle w:val="aff8"/>
@@ -470,7 +470,7 @@
             <w:noProof/>
             <w:webHidden/>
           </w:rPr>
-          <w:instrText xml:space="preserve"> PAGEREF _Toc242378563 \h </w:instrText>
+          <w:instrText xml:space="preserve"> PAGEREF _Toc242385944 \h </w:instrText>
         </w:r>
         <w:r>
           <w:rPr>
@@ -516,7 +516,7 @@
           <w14:ligatures w14:val="standardContextual"/>
         </w:rPr>
       </w:pPr>
-      <w:hyperlink w:anchor="_Toc242378564" w:history="1">
+      <w:hyperlink w:anchor="_Toc242385945" w:history="1">
         <w:r>
           <w:rPr>
             <w:rStyle w:val="aff8"/>
@@ -543,7 +543,7 @@
             <w:noProof/>
             <w:webHidden/>
           </w:rPr>
-          <w:instrText xml:space="preserve"> PAGEREF _Toc242378564 \h </w:instrText>
+          <w:instrText xml:space="preserve"> PAGEREF _Toc242385945 \h </w:instrText>
         </w:r>
         <w:r>
           <w:rPr>
@@ -589,7 +589,7 @@
           <w14:ligatures w14:val="standardContextual"/>
         </w:rPr>
       </w:pPr>
-      <w:hyperlink w:anchor="_Toc242378565" w:history="1">
+      <w:hyperlink w:anchor="_Toc242385946" w:history="1">
         <w:r>
           <w:rPr>
             <w:rStyle w:val="aff8"/>
@@ -616,7 +616,7 @@
             <w:noProof/>
             <w:webHidden/>
           </w:rPr>
-          <w:instrText xml:space="preserve"> PAGEREF _Toc242378565 \h </w:instrText>
+          <w:instrText xml:space="preserve"> PAGEREF _Toc242385946 \h </w:instrText>
         </w:r>
         <w:r>
           <w:rPr>
@@ -662,7 +662,7 @@
           <w14:ligatures w14:val="standardContextual"/>
         </w:rPr>
       </w:pPr>
-      <w:hyperlink w:anchor="_Toc242378566" w:history="1">
+      <w:hyperlink w:anchor="_Toc242385947" w:history="1">
         <w:r>
           <w:rPr>
             <w:rStyle w:val="aff8"/>
@@ -689,7 +689,7 @@
             <w:noProof/>
             <w:webHidden/>
           </w:rPr>
-          <w:instrText xml:space="preserve"> PAGEREF _Toc242378566 \h </w:instrText>
+          <w:instrText xml:space="preserve"> PAGEREF _Toc242385947 \h </w:instrText>
         </w:r>
         <w:r>
           <w:rPr>
@@ -735,7 +735,7 @@
           <w14:ligatures w14:val="standardContextual"/>
         </w:rPr>
       </w:pPr>
-      <w:hyperlink w:anchor="_Toc242378567" w:history="1">
+      <w:hyperlink w:anchor="_Toc242385948" w:history="1">
         <w:r>
           <w:rPr>
             <w:rStyle w:val="aff8"/>
@@ -762,7 +762,7 @@
             <w:noProof/>
             <w:webHidden/>
           </w:rPr>
-          <w:instrText xml:space="preserve"> PAGEREF _Toc242378567 \h </w:instrText>
+          <w:instrText xml:space="preserve"> PAGEREF _Toc242385948 \h </w:instrText>
         </w:r>
         <w:r>
           <w:rPr>
@@ -808,7 +808,7 @@
           <w14:ligatures w14:val="standardContextual"/>
         </w:rPr>
       </w:pPr>
-      <w:hyperlink w:anchor="_Toc242378568" w:history="1">
+      <w:hyperlink w:anchor="_Toc242385949" w:history="1">
         <w:r>
           <w:rPr>
             <w:rStyle w:val="aff8"/>
@@ -835,7 +835,7 @@
             <w:noProof/>
             <w:webHidden/>
           </w:rPr>
-          <w:instrText xml:space="preserve"> PAGEREF _Toc242378568 \h </w:instrText>
+          <w:instrText xml:space="preserve"> PAGEREF _Toc242385949 \h </w:instrText>
         </w:r>
         <w:r>
           <w:rPr>
@@ -881,7 +881,7 @@
           <w14:ligatures w14:val="standardContextual"/>
         </w:rPr>
       </w:pPr>
-      <w:hyperlink w:anchor="_Toc242378569" w:history="1">
+      <w:hyperlink w:anchor="_Toc242385950" w:history="1">
         <w:r>
           <w:rPr>
             <w:rStyle w:val="aff8"/>
@@ -908,7 +908,7 @@
             <w:noProof/>
             <w:webHidden/>
           </w:rPr>
-          <w:instrText xml:space="preserve"> PAGEREF _Toc242378569 \h </w:instrText>
+          <w:instrText xml:space="preserve"> PAGEREF _Toc242385950 \h </w:instrText>
         </w:r>
         <w:r>
           <w:rPr>
@@ -954,7 +954,7 @@
           <w14:ligatures w14:val="standardContextual"/>
         </w:rPr>
       </w:pPr>
-      <w:hyperlink w:anchor="_Toc242378570" w:history="1">
+      <w:hyperlink w:anchor="_Toc242385951" w:history="1">
         <w:r>
           <w:rPr>
             <w:rStyle w:val="aff8"/>
@@ -989,7 +989,7 @@
             <w:noProof/>
             <w:webHidden/>
           </w:rPr>
-          <w:instrText xml:space="preserve"> PAGEREF _Toc242378570 \h </w:instrText>
+          <w:instrText xml:space="preserve"> PAGEREF _Toc242385951 \h </w:instrText>
         </w:r>
         <w:r>
           <w:rPr>
@@ -1035,7 +1035,7 @@
           <w14:ligatures w14:val="standardContextual"/>
         </w:rPr>
       </w:pPr>
-      <w:hyperlink w:anchor="_Toc242378571" w:history="1">
+      <w:hyperlink w:anchor="_Toc242385952" w:history="1">
         <w:r>
           <w:rPr>
             <w:rStyle w:val="aff8"/>
@@ -1062,7 +1062,7 @@
             <w:noProof/>
             <w:webHidden/>
           </w:rPr>
-          <w:instrText xml:space="preserve"> PAGEREF _Toc242378571 \h </w:instrText>
+          <w:instrText xml:space="preserve"> PAGEREF _Toc242385952 \h </w:instrText>
         </w:r>
         <w:r>
           <w:rPr>
@@ -1108,7 +1108,7 @@
           <w14:ligatures w14:val="standardContextual"/>
         </w:rPr>
       </w:pPr>
-      <w:hyperlink w:anchor="_Toc242378572" w:history="1">
+      <w:hyperlink w:anchor="_Toc242385953" w:history="1">
         <w:r>
           <w:rPr>
             <w:rStyle w:val="aff8"/>
@@ -1135,7 +1135,7 @@
             <w:noProof/>
             <w:webHidden/>
           </w:rPr>
-          <w:instrText xml:space="preserve"> PAGEREF _Toc242378572 \h </w:instrText>
+          <w:instrText xml:space="preserve"> PAGEREF _Toc242385953 \h </w:instrText>
         </w:r>
         <w:r>
           <w:rPr>
@@ -1181,7 +1181,7 @@
           <w14:ligatures w14:val="standardContextual"/>
         </w:rPr>
       </w:pPr>
-      <w:hyperlink w:anchor="_Toc242378573" w:history="1">
+      <w:hyperlink w:anchor="_Toc242385954" w:history="1">
         <w:r>
           <w:rPr>
             <w:rStyle w:val="aff8"/>
@@ -1208,7 +1208,7 @@
             <w:noProof/>
             <w:webHidden/>
           </w:rPr>
-          <w:instrText xml:space="preserve"> PAGEREF _Toc242378573 \h </w:instrText>
+          <w:instrText xml:space="preserve"> PAGEREF _Toc242385954 \h </w:instrText>
         </w:r>
         <w:r>
           <w:rPr>
@@ -1254,7 +1254,7 @@
           <w14:ligatures w14:val="standardContextual"/>
         </w:rPr>
       </w:pPr>
-      <w:hyperlink w:anchor="_Toc242378574" w:history="1">
+      <w:hyperlink w:anchor="_Toc242385955" w:history="1">
         <w:r>
           <w:rPr>
             <w:rStyle w:val="aff8"/>
@@ -1281,7 +1281,7 @@
             <w:noProof/>
             <w:webHidden/>
           </w:rPr>
-          <w:instrText xml:space="preserve"> PAGEREF _Toc242378574 \h </w:instrText>
+          <w:instrText xml:space="preserve"> PAGEREF _Toc242385955 \h </w:instrText>
         </w:r>
         <w:r>
           <w:rPr>
@@ -1327,7 +1327,7 @@
           <w14:ligatures w14:val="standardContextual"/>
         </w:rPr>
       </w:pPr>
-      <w:hyperlink w:anchor="_Toc242378575" w:history="1">
+      <w:hyperlink w:anchor="_Toc242385956" w:history="1">
         <w:r>
           <w:rPr>
             <w:rStyle w:val="aff8"/>
@@ -1354,7 +1354,7 @@
             <w:noProof/>
             <w:webHidden/>
           </w:rPr>
-          <w:instrText xml:space="preserve"> PAGEREF _Toc242378575 \h </w:instrText>
+          <w:instrText xml:space="preserve"> PAGEREF _Toc242385956 \h </w:instrText>
         </w:r>
         <w:r>
           <w:rPr>
@@ -1400,7 +1400,7 @@
           <w14:ligatures w14:val="standardContextual"/>
         </w:rPr>
       </w:pPr>
-      <w:hyperlink w:anchor="_Toc242378576" w:history="1">
+      <w:hyperlink w:anchor="_Toc242385957" w:history="1">
         <w:r>
           <w:rPr>
             <w:rStyle w:val="aff8"/>
@@ -1427,7 +1427,7 @@
             <w:noProof/>
             <w:webHidden/>
           </w:rPr>
-          <w:instrText xml:space="preserve"> PAGEREF _Toc242378576 \h </w:instrText>
+          <w:instrText xml:space="preserve"> PAGEREF _Toc242385957 \h </w:instrText>
         </w:r>
         <w:r>
           <w:rPr>
@@ -1473,7 +1473,7 @@
           <w14:ligatures w14:val="standardContextual"/>
         </w:rPr>
       </w:pPr>
-      <w:hyperlink w:anchor="_Toc242378577" w:history="1">
+      <w:hyperlink w:anchor="_Toc242385958" w:history="1">
         <w:r>
           <w:rPr>
             <w:rStyle w:val="aff8"/>
@@ -1500,7 +1500,7 @@
             <w:noProof/>
             <w:webHidden/>
           </w:rPr>
-          <w:instrText xml:space="preserve"> PAGEREF _Toc242378577 \h </w:instrText>
+          <w:instrText xml:space="preserve"> PAGEREF _Toc242385958 \h </w:instrText>
         </w:r>
         <w:r>
           <w:rPr>
@@ -1546,7 +1546,7 @@
           <w14:ligatures w14:val="standardContextual"/>
         </w:rPr>
       </w:pPr>
-      <w:hyperlink w:anchor="_Toc242378578" w:history="1">
+      <w:hyperlink w:anchor="_Toc242385959" w:history="1">
         <w:r>
           <w:rPr>
             <w:rStyle w:val="aff8"/>
@@ -1588,7 +1588,7 @@
             <w:noProof/>
             <w:webHidden/>
           </w:rPr>
-          <w:instrText xml:space="preserve"> PAGEREF _Toc242378578 \h </w:instrText>
+          <w:instrText xml:space="preserve"> PAGEREF _Toc242385959 \h </w:instrText>
         </w:r>
         <w:r>
           <w:rPr>
@@ -1634,7 +1634,7 @@
           <w14:ligatures w14:val="standardContextual"/>
         </w:rPr>
       </w:pPr>
-      <w:hyperlink w:anchor="_Toc242378579" w:history="1">
+      <w:hyperlink w:anchor="_Toc242385960" w:history="1">
         <w:r>
           <w:rPr>
             <w:rStyle w:val="aff8"/>
@@ -1661,7 +1661,7 @@
             <w:noProof/>
             <w:webHidden/>
           </w:rPr>
-          <w:instrText xml:space="preserve"> PAGEREF _Toc242378579 \h </w:instrText>
+          <w:instrText xml:space="preserve"> PAGEREF _Toc242385960 \h </w:instrText>
         </w:r>
         <w:r>
           <w:rPr>
@@ -1707,7 +1707,7 @@
           <w14:ligatures w14:val="standardContextual"/>
         </w:rPr>
       </w:pPr>
-      <w:hyperlink w:anchor="_Toc242378580" w:history="1">
+      <w:hyperlink w:anchor="_Toc242385961" w:history="1">
         <w:r>
           <w:rPr>
             <w:rStyle w:val="aff8"/>
@@ -1749,7 +1749,7 @@
             <w:noProof/>
             <w:webHidden/>
           </w:rPr>
-          <w:instrText xml:space="preserve"> PAGEREF _Toc242378580 \h </w:instrText>
+          <w:instrText xml:space="preserve"> PAGEREF _Toc242385961 \h </w:instrText>
         </w:r>
         <w:r>
           <w:rPr>
@@ -1795,7 +1795,7 @@
           <w14:ligatures w14:val="standardContextual"/>
         </w:rPr>
       </w:pPr>
-      <w:hyperlink w:anchor="_Toc242378581" w:history="1">
+      <w:hyperlink w:anchor="_Toc242385962" w:history="1">
         <w:r>
           <w:rPr>
             <w:rStyle w:val="aff8"/>
@@ -1822,7 +1822,7 @@
             <w:noProof/>
             <w:webHidden/>
           </w:rPr>
-          <w:instrText xml:space="preserve"> PAGEREF _Toc242378581 \h </w:instrText>
+          <w:instrText xml:space="preserve"> PAGEREF _Toc242385962 \h </w:instrText>
         </w:r>
         <w:r>
           <w:rPr>
@@ -1868,7 +1868,7 @@
         <w:pStyle w:val="1"/>
         <w:ind w:firstLine="709"/>
       </w:pPr>
-      <w:bookmarkStart w:id="0" w:name="_Toc242378561"/>
+      <w:bookmarkStart w:id="0" w:name="_Toc242385942"/>
       <w:r>
         <w:rPr>
           <w:rFonts w:ascii="Times New Roman" w:hAnsi="Times New Roman"/>
@@ -1933,7 +1933,7 @@
         <w:pStyle w:val="1"/>
         <w:ind w:firstLine="709"/>
       </w:pPr>
-      <w:bookmarkStart w:id="1" w:name="_Toc242378562"/>
+      <w:bookmarkStart w:id="1" w:name="_Toc242385943"/>
       <w:r>
         <w:rPr>
           <w:rFonts w:ascii="Times New Roman" w:hAnsi="Times New Roman"/>
@@ -2133,7 +2133,7 @@
         <w:pStyle w:val="1"/>
         <w:ind w:firstLine="709"/>
       </w:pPr>
-      <w:bookmarkStart w:id="2" w:name="_Toc242378563"/>
+      <w:bookmarkStart w:id="2" w:name="_Toc242385944"/>
       <w:r>
         <w:rPr>
           <w:rFonts w:ascii="Times New Roman" w:hAnsi="Times New Roman"/>
@@ -2149,7 +2149,7 @@
         <w:spacing w:before="360"/>
         <w:ind w:firstLine="709"/>
       </w:pPr>
-      <w:bookmarkStart w:id="3" w:name="_Toc242378564"/>
+      <w:bookmarkStart w:id="3" w:name="_Toc242385945"/>
       <w:r>
         <w:rPr>
           <w:rFonts w:ascii="Times New Roman" w:hAnsi="Times New Roman"/>
@@ -2188,7 +2188,7 @@
         <w:rPr>
           <w:i/>
         </w:rPr>
-        <w:t>net8.0</w:t>
+        <w:t>net10.0</w:t>
       </w:r>
       <w:r>
         <w:t xml:space="preserve"> (</w:t>
@@ -2200,7 +2200,7 @@
         <w:t>SDK</w:t>
       </w:r>
       <w:r>
-        <w:t xml:space="preserve"> 9.0.318). Все замеры выполнены в режиме </w:t>
+        <w:t xml:space="preserve"> 10.0.401). Все замеры выполнены в режиме </w:t>
       </w:r>
       <w:r>
         <w:rPr>
@@ -2251,7 +2251,7 @@
         <w:rPr>
           <w:i/>
         </w:rPr>
-        <w:t>net8.0</w:t>
+        <w:t>net10.0</w:t>
       </w:r>
       <w:r>
         <w:t>\</w:t>
@@ -2317,7 +2317,7 @@
         <w:spacing w:before="360"/>
         <w:ind w:firstLine="709"/>
       </w:pPr>
-      <w:bookmarkStart w:id="4" w:name="_Toc242378565"/>
+      <w:bookmarkStart w:id="4" w:name="_Toc242385946"/>
       <w:r>
         <w:rPr>
           <w:rFonts w:ascii="Times New Roman" w:hAnsi="Times New Roman"/>
@@ -2365,7 +2365,7 @@
         </w:rPr>
         <w:lastRenderedPageBreak/>
         <w:drawing>
-          <wp:inline distT="0" distB="0" distL="0" distR="0" wp14:anchorId="1F5956BD" wp14:editId="416154C5">
+          <wp:inline distT="0" distB="0" distL="0" distR="0" wp14:anchorId="3426548D" wp14:editId="3D867DF0">
             <wp:extent cx="5580000" cy="4377320"/>
             <wp:effectExtent l="0" t="0" r="0" b="0"/>
             <wp:docPr id="1" name="Picture 1"/>
@@ -2426,7 +2426,7 @@
         <w:spacing w:before="360"/>
         <w:ind w:firstLine="709"/>
       </w:pPr>
-      <w:bookmarkStart w:id="5" w:name="_Toc242378566"/>
+      <w:bookmarkStart w:id="5" w:name="_Toc242385947"/>
       <w:r>
         <w:rPr>
           <w:rFonts w:ascii="Times New Roman" w:hAnsi="Times New Roman"/>
@@ -2495,228 +2495,156 @@
     </w:p>
     <w:p>
       <w:pPr>
-        <w:spacing w:line="240" w:lineRule="auto"/>
-      </w:pPr>
-      <w:r>
-        <w:rPr>
-          <w:i/>
-          <w:sz w:val="24"/>
-        </w:rPr>
+        <w:pStyle w:val="Listing"/>
+      </w:pPr>
+      <w:r>
         <w:t>public class MemoryLeakExample</w:t>
       </w:r>
     </w:p>
     <w:p>
       <w:pPr>
-        <w:spacing w:line="240" w:lineRule="auto"/>
-      </w:pPr>
-      <w:r>
-        <w:rPr>
-          <w:i/>
-          <w:sz w:val="24"/>
-        </w:rPr>
+        <w:pStyle w:val="Listing"/>
+      </w:pPr>
+      <w:r>
         <w:t>{</w:t>
       </w:r>
     </w:p>
     <w:p>
       <w:pPr>
-        <w:spacing w:line="240" w:lineRule="auto"/>
-      </w:pPr>
-      <w:r>
-        <w:rPr>
-          <w:i/>
-          <w:sz w:val="24"/>
-        </w:rPr>
+        <w:pStyle w:val="Listing"/>
+      </w:pPr>
+      <w:r>
         <w:t xml:space="preserve">    private static List&lt;byte[]&gt; _staticList = new List&lt;byte[]&gt;();</w:t>
       </w:r>
     </w:p>
     <w:p>
       <w:pPr>
-        <w:spacing w:line="240" w:lineRule="auto"/>
-      </w:pPr>
-    </w:p>
-    <w:p>
-      <w:pPr>
-        <w:spacing w:line="240" w:lineRule="auto"/>
-      </w:pPr>
-      <w:r>
-        <w:rPr>
-          <w:i/>
-          <w:sz w:val="24"/>
-        </w:rPr>
+        <w:pStyle w:val="Listing"/>
+      </w:pPr>
+    </w:p>
+    <w:p>
+      <w:pPr>
+        <w:pStyle w:val="Listing"/>
+      </w:pPr>
+      <w:r>
         <w:t xml:space="preserve">    public static void CreateMemoryLeak()</w:t>
       </w:r>
     </w:p>
     <w:p>
       <w:pPr>
-        <w:spacing w:line="240" w:lineRule="auto"/>
-      </w:pPr>
-      <w:r>
-        <w:rPr>
-          <w:i/>
-          <w:sz w:val="24"/>
-        </w:rPr>
+        <w:pStyle w:val="Listing"/>
+      </w:pPr>
+      <w:r>
         <w:t xml:space="preserve">    {</w:t>
       </w:r>
     </w:p>
     <w:p>
       <w:pPr>
-        <w:spacing w:line="240" w:lineRule="auto"/>
-      </w:pPr>
-      <w:r>
-        <w:rPr>
-          <w:i/>
-          <w:sz w:val="24"/>
-        </w:rPr>
+        <w:pStyle w:val="Listing"/>
+      </w:pPr>
+      <w:r>
         <w:lastRenderedPageBreak/>
         <w:t xml:space="preserve">        // Создаем объекты, которые никогда не будут собраны</w:t>
       </w:r>
     </w:p>
     <w:p>
       <w:pPr>
-        <w:spacing w:line="240" w:lineRule="auto"/>
-      </w:pPr>
-      <w:r>
-        <w:rPr>
-          <w:i/>
-          <w:sz w:val="24"/>
-        </w:rPr>
+        <w:pStyle w:val="Listing"/>
+      </w:pPr>
+      <w:r>
         <w:t xml:space="preserve">        for (int i = 0; i &lt; 1000; i++)</w:t>
       </w:r>
     </w:p>
     <w:p>
       <w:pPr>
-        <w:spacing w:line="240" w:lineRule="auto"/>
-      </w:pPr>
-      <w:r>
-        <w:rPr>
-          <w:i/>
-          <w:sz w:val="24"/>
-        </w:rPr>
+        <w:pStyle w:val="Listing"/>
+      </w:pPr>
+      <w:r>
         <w:t xml:space="preserve">        {</w:t>
       </w:r>
     </w:p>
     <w:p>
       <w:pPr>
-        <w:spacing w:line="240" w:lineRule="auto"/>
-      </w:pPr>
-      <w:r>
-        <w:rPr>
-          <w:i/>
-          <w:sz w:val="24"/>
-        </w:rPr>
+        <w:pStyle w:val="Listing"/>
+      </w:pPr>
+      <w:r>
         <w:t xml:space="preserve">            _staticList.Add(new byte[1024 * 10]); // 10KB каждый</w:t>
       </w:r>
     </w:p>
     <w:p>
       <w:pPr>
-        <w:spacing w:line="240" w:lineRule="auto"/>
-      </w:pPr>
-      <w:r>
-        <w:rPr>
-          <w:i/>
-          <w:sz w:val="24"/>
-        </w:rPr>
+        <w:pStyle w:val="Listing"/>
+      </w:pPr>
+      <w:r>
         <w:t xml:space="preserve">        }</w:t>
       </w:r>
     </w:p>
     <w:p>
       <w:pPr>
-        <w:spacing w:line="240" w:lineRule="auto"/>
-      </w:pPr>
-      <w:r>
-        <w:rPr>
-          <w:i/>
-          <w:sz w:val="24"/>
-        </w:rPr>
+        <w:pStyle w:val="Listing"/>
+      </w:pPr>
+      <w:r>
         <w:t xml:space="preserve">    }</w:t>
       </w:r>
     </w:p>
     <w:p>
       <w:pPr>
-        <w:spacing w:line="240" w:lineRule="auto"/>
-      </w:pPr>
-    </w:p>
-    <w:p>
-      <w:pPr>
-        <w:spacing w:line="240" w:lineRule="auto"/>
-      </w:pPr>
-      <w:r>
-        <w:rPr>
-          <w:i/>
-          <w:sz w:val="24"/>
-        </w:rPr>
+        <w:pStyle w:val="Listing"/>
+      </w:pPr>
+    </w:p>
+    <w:p>
+      <w:pPr>
+        <w:pStyle w:val="Listing"/>
+      </w:pPr>
+      <w:r>
         <w:t xml:space="preserve">    public static void ClearMemoryLeak()</w:t>
       </w:r>
     </w:p>
     <w:p>
       <w:pPr>
-        <w:spacing w:line="240" w:lineRule="auto"/>
-      </w:pPr>
-      <w:r>
-        <w:rPr>
-          <w:i/>
-          <w:sz w:val="24"/>
-        </w:rPr>
+        <w:pStyle w:val="Listing"/>
+      </w:pPr>
+      <w:r>
         <w:t xml:space="preserve">    {</w:t>
       </w:r>
     </w:p>
     <w:p>
       <w:pPr>
-        <w:spacing w:line="240" w:lineRule="auto"/>
-      </w:pPr>
-      <w:r>
-        <w:rPr>
-          <w:i/>
-          <w:sz w:val="24"/>
-        </w:rPr>
+        <w:pStyle w:val="Listing"/>
+      </w:pPr>
+      <w:r>
         <w:t xml:space="preserve">        _staticList.Clear();</w:t>
       </w:r>
     </w:p>
     <w:p>
       <w:pPr>
-        <w:spacing w:line="240" w:lineRule="auto"/>
-      </w:pPr>
-      <w:r>
-        <w:rPr>
-          <w:i/>
-          <w:sz w:val="24"/>
-        </w:rPr>
+        <w:pStyle w:val="Listing"/>
+      </w:pPr>
+      <w:r>
         <w:t xml:space="preserve">        GC.Collect();</w:t>
       </w:r>
     </w:p>
     <w:p>
       <w:pPr>
-        <w:spacing w:line="240" w:lineRule="auto"/>
-      </w:pPr>
-      <w:r>
-        <w:rPr>
-          <w:i/>
-          <w:sz w:val="24"/>
-        </w:rPr>
+        <w:pStyle w:val="Listing"/>
+      </w:pPr>
+      <w:r>
         <w:t xml:space="preserve">        GC.WaitForPendingFinalizers();</w:t>
       </w:r>
     </w:p>
     <w:p>
       <w:pPr>
-        <w:spacing w:line="240" w:lineRule="auto"/>
-      </w:pPr>
-      <w:r>
-        <w:rPr>
-          <w:i/>
-          <w:sz w:val="24"/>
-        </w:rPr>
+        <w:pStyle w:val="Listing"/>
+      </w:pPr>
+      <w:r>
         <w:t xml:space="preserve">    }</w:t>
       </w:r>
     </w:p>
     <w:p>
       <w:pPr>
-        <w:spacing w:line="240" w:lineRule="auto"/>
-      </w:pPr>
-      <w:r>
-        <w:rPr>
-          <w:i/>
-          <w:sz w:val="24"/>
-        </w:rPr>
+        <w:pStyle w:val="Listing"/>
+      </w:pPr>
+      <w:r>
         <w:t>}</w:t>
       </w:r>
     </w:p>
@@ -2741,7 +2669,7 @@
           <w:noProof/>
         </w:rPr>
         <w:drawing>
-          <wp:inline distT="0" distB="0" distL="0" distR="0" wp14:anchorId="4DFDE7AD" wp14:editId="20ADB715">
+          <wp:inline distT="0" distB="0" distL="0" distR="0" wp14:anchorId="6B9A3C6C" wp14:editId="170CEC14">
             <wp:extent cx="5580000" cy="2817087"/>
             <wp:effectExtent l="0" t="0" r="0" b="0"/>
             <wp:docPr id="2" name="Picture 2"/>
@@ -2826,7 +2754,7 @@
         </w:rPr>
         <w:lastRenderedPageBreak/>
         <w:drawing>
-          <wp:inline distT="0" distB="0" distL="0" distR="0" wp14:anchorId="4355754C" wp14:editId="4081C830">
+          <wp:inline distT="0" distB="0" distL="0" distR="0" wp14:anchorId="65C98405" wp14:editId="7EDA9BF7">
             <wp:extent cx="5580000" cy="2817087"/>
             <wp:effectExtent l="0" t="0" r="0" b="0"/>
             <wp:docPr id="3" name="Picture 3"/>
@@ -2878,7 +2806,7 @@
         <w:jc w:val="both"/>
       </w:pPr>
       <w:r>
-        <w:t xml:space="preserve">Добавление миллиона чисел в список объектов с упаковкой заняло 168 мс, в список целых чисел без упаковки – 10 мс. После очистки управляемая память уменьшилась до 4 МБ. Новый объект относится к поколению 0, а после вызова </w:t>
+        <w:t xml:space="preserve">Добавление миллиона чисел в список объектов с упаковкой заняло 51 мс, в список целых чисел без упаковки – 7 мс. После очистки управляемая память уменьшилась до 4 МБ. Новый объект относится к поколению 0, а после вызова </w:t>
       </w:r>
       <w:r>
         <w:rPr>
@@ -2899,7 +2827,7 @@
         <w:spacing w:before="360"/>
         <w:ind w:firstLine="709"/>
       </w:pPr>
-      <w:bookmarkStart w:id="6" w:name="_Toc242378567"/>
+      <w:bookmarkStart w:id="6" w:name="_Toc242385948"/>
       <w:r>
         <w:rPr>
           <w:rFonts w:ascii="Times New Roman" w:hAnsi="Times New Roman"/>
@@ -3016,735 +2944,490 @@
     </w:p>
     <w:p>
       <w:pPr>
-        <w:spacing w:line="240" w:lineRule="auto"/>
-      </w:pPr>
-      <w:r>
-        <w:rPr>
-          <w:i/>
-          <w:sz w:val="24"/>
-        </w:rPr>
+        <w:pStyle w:val="Listing"/>
+      </w:pPr>
+      <w:r>
         <w:t>public class MemoryMonitor : IDisposable</w:t>
       </w:r>
     </w:p>
     <w:p>
       <w:pPr>
-        <w:spacing w:line="240" w:lineRule="auto"/>
-      </w:pPr>
-      <w:r>
-        <w:rPr>
-          <w:i/>
-          <w:sz w:val="24"/>
-        </w:rPr>
+        <w:pStyle w:val="Listing"/>
+      </w:pPr>
+      <w:r>
         <w:t>{</w:t>
       </w:r>
     </w:p>
     <w:p>
       <w:pPr>
-        <w:spacing w:line="240" w:lineRule="auto"/>
-      </w:pPr>
-      <w:r>
-        <w:rPr>
-          <w:i/>
-          <w:sz w:val="24"/>
-        </w:rPr>
+        <w:pStyle w:val="Listing"/>
+      </w:pPr>
+      <w:r>
         <w:t xml:space="preserve">    private bool _disposed;</w:t>
       </w:r>
     </w:p>
     <w:p>
       <w:pPr>
-        <w:spacing w:line="240" w:lineRule="auto"/>
-      </w:pPr>
-      <w:r>
-        <w:rPr>
-          <w:i/>
-          <w:sz w:val="24"/>
-        </w:rPr>
+        <w:pStyle w:val="Listing"/>
+      </w:pPr>
+      <w:r>
         <w:t xml:space="preserve">    private List&lt;byte[]&gt; _allocatedMemory = new List&lt;byte[]&gt;();</w:t>
       </w:r>
     </w:p>
     <w:p>
       <w:pPr>
-        <w:spacing w:line="240" w:lineRule="auto"/>
-      </w:pPr>
-      <w:r>
-        <w:rPr>
-          <w:i/>
-          <w:sz w:val="24"/>
-        </w:rPr>
+        <w:pStyle w:val="Listing"/>
+      </w:pPr>
+      <w:r>
         <w:t xml:space="preserve">    private Random _random = new Random();</w:t>
       </w:r>
     </w:p>
     <w:p>
       <w:pPr>
-        <w:spacing w:line="240" w:lineRule="auto"/>
-      </w:pPr>
-    </w:p>
-    <w:p>
-      <w:pPr>
-        <w:spacing w:line="240" w:lineRule="auto"/>
-      </w:pPr>
-      <w:r>
-        <w:rPr>
-          <w:i/>
-          <w:sz w:val="24"/>
-        </w:rPr>
+        <w:pStyle w:val="Listing"/>
+      </w:pPr>
+    </w:p>
+    <w:p>
+      <w:pPr>
+        <w:pStyle w:val="Listing"/>
+      </w:pPr>
+      <w:r>
         <w:t xml:space="preserve">    public void AllocateMemory(int sizeInMB)</w:t>
       </w:r>
     </w:p>
     <w:p>
       <w:pPr>
-        <w:spacing w:line="240" w:lineRule="auto"/>
-      </w:pPr>
-      <w:r>
-        <w:rPr>
-          <w:i/>
-          <w:sz w:val="24"/>
-        </w:rPr>
+        <w:pStyle w:val="Listing"/>
+      </w:pPr>
+      <w:r>
         <w:t xml:space="preserve">    {</w:t>
       </w:r>
     </w:p>
     <w:p>
       <w:pPr>
-        <w:spacing w:line="240" w:lineRule="auto"/>
-      </w:pPr>
-      <w:r>
-        <w:rPr>
-          <w:i/>
-          <w:sz w:val="24"/>
-        </w:rPr>
+        <w:pStyle w:val="Listing"/>
+      </w:pPr>
+      <w:r>
         <w:t xml:space="preserve">        // Выделяем память с возможной утечкой</w:t>
       </w:r>
     </w:p>
     <w:p>
       <w:pPr>
-        <w:spacing w:line="240" w:lineRule="auto"/>
-      </w:pPr>
-      <w:r>
-        <w:rPr>
-          <w:i/>
-          <w:sz w:val="24"/>
-        </w:rPr>
+        <w:pStyle w:val="Listing"/>
+      </w:pPr>
+      <w:r>
         <w:t xml:space="preserve">        var data = new byte[sizeInMB * 1024 * 1024];</w:t>
       </w:r>
     </w:p>
     <w:p>
       <w:pPr>
-        <w:spacing w:line="240" w:lineRule="auto"/>
-      </w:pPr>
-      <w:r>
-        <w:rPr>
-          <w:i/>
-          <w:sz w:val="24"/>
-        </w:rPr>
+        <w:pStyle w:val="Listing"/>
+      </w:pPr>
+      <w:r>
         <w:t xml:space="preserve">        _allocatedMemory.Add(data);</w:t>
       </w:r>
     </w:p>
     <w:p>
       <w:pPr>
-        <w:spacing w:line="240" w:lineRule="auto"/>
-      </w:pPr>
-      <w:r>
-        <w:rPr>
-          <w:i/>
-          <w:sz w:val="24"/>
-        </w:rPr>
+        <w:pStyle w:val="Listing"/>
+      </w:pPr>
+      <w:r>
         <w:t xml:space="preserve">    }</w:t>
       </w:r>
     </w:p>
     <w:p>
       <w:pPr>
-        <w:spacing w:line="240" w:lineRule="auto"/>
-      </w:pPr>
-    </w:p>
-    <w:p>
-      <w:pPr>
-        <w:spacing w:line="240" w:lineRule="auto"/>
-      </w:pPr>
-      <w:r>
-        <w:rPr>
-          <w:i/>
-          <w:sz w:val="24"/>
-        </w:rPr>
+        <w:pStyle w:val="Listing"/>
+      </w:pPr>
+    </w:p>
+    <w:p>
+      <w:pPr>
+        <w:pStyle w:val="Listing"/>
+      </w:pPr>
+      <w:r>
+        <w:lastRenderedPageBreak/>
         <w:t xml:space="preserve">    public void AllocateLOHObjects(int count)</w:t>
       </w:r>
     </w:p>
     <w:p>
       <w:pPr>
-        <w:spacing w:line="240" w:lineRule="auto"/>
-      </w:pPr>
-      <w:r>
-        <w:rPr>
-          <w:i/>
-          <w:sz w:val="24"/>
-        </w:rPr>
+        <w:pStyle w:val="Listing"/>
+      </w:pPr>
+      <w:r>
         <w:t xml:space="preserve">    {</w:t>
       </w:r>
     </w:p>
     <w:p>
       <w:pPr>
-        <w:spacing w:line="240" w:lineRule="auto"/>
-      </w:pPr>
-      <w:r>
-        <w:rPr>
-          <w:i/>
-          <w:sz w:val="24"/>
-        </w:rPr>
-        <w:t xml:space="preserve">        </w:t>
-      </w:r>
-      <w:r>
-        <w:rPr>
-          <w:i/>
-          <w:sz w:val="24"/>
-        </w:rPr>
-        <w:t>for (int i = 0; i &lt; count; i++)</w:t>
-      </w:r>
-    </w:p>
-    <w:p>
-      <w:pPr>
-        <w:spacing w:line="240" w:lineRule="auto"/>
-      </w:pPr>
-      <w:r>
-        <w:rPr>
-          <w:i/>
-          <w:sz w:val="24"/>
-        </w:rPr>
+        <w:pStyle w:val="Listing"/>
+      </w:pPr>
+      <w:r>
+        <w:t xml:space="preserve">        for (int i = 0; i &lt; count; i++)</w:t>
+      </w:r>
+    </w:p>
+    <w:p>
+      <w:pPr>
+        <w:pStyle w:val="Listing"/>
+      </w:pPr>
+      <w:r>
         <w:t xml:space="preserve">        {</w:t>
       </w:r>
     </w:p>
     <w:p>
       <w:pPr>
-        <w:spacing w:line="240" w:lineRule="auto"/>
-      </w:pPr>
-      <w:r>
-        <w:rPr>
-          <w:i/>
-          <w:sz w:val="24"/>
-        </w:rPr>
+        <w:pStyle w:val="Listing"/>
+      </w:pPr>
+      <w:r>
         <w:t xml:space="preserve">            // Объекты &gt; 85KB</w:t>
       </w:r>
     </w:p>
     <w:p>
       <w:pPr>
-        <w:spacing w:line="240" w:lineRule="auto"/>
-      </w:pPr>
-      <w:r>
-        <w:rPr>
-          <w:i/>
-          <w:sz w:val="24"/>
-        </w:rPr>
+        <w:pStyle w:val="Listing"/>
+      </w:pPr>
+      <w:r>
         <w:t xml:space="preserve">            var largeObject = new byte[90000 + i];</w:t>
       </w:r>
     </w:p>
     <w:p>
       <w:pPr>
-        <w:spacing w:line="240" w:lineRule="auto"/>
-      </w:pPr>
-      <w:r>
-        <w:rPr>
-          <w:i/>
-          <w:sz w:val="24"/>
-        </w:rPr>
+        <w:pStyle w:val="Listing"/>
+      </w:pPr>
+      <w:r>
         <w:t xml:space="preserve">        }</w:t>
       </w:r>
     </w:p>
     <w:p>
       <w:pPr>
-        <w:spacing w:line="240" w:lineRule="auto"/>
-      </w:pPr>
-      <w:r>
-        <w:rPr>
-          <w:i/>
-          <w:sz w:val="24"/>
-        </w:rPr>
+        <w:pStyle w:val="Listing"/>
+      </w:pPr>
+      <w:r>
         <w:t xml:space="preserve">    }</w:t>
       </w:r>
     </w:p>
     <w:p>
       <w:pPr>
-        <w:spacing w:line="240" w:lineRule="auto"/>
-      </w:pPr>
-    </w:p>
-    <w:p>
-      <w:pPr>
-        <w:spacing w:line="240" w:lineRule="auto"/>
-      </w:pPr>
-      <w:r>
-        <w:rPr>
-          <w:i/>
-          <w:sz w:val="24"/>
-        </w:rPr>
+        <w:pStyle w:val="Listing"/>
+      </w:pPr>
+    </w:p>
+    <w:p>
+      <w:pPr>
+        <w:pStyle w:val="Listing"/>
+      </w:pPr>
+      <w:r>
         <w:t xml:space="preserve">    public void SimulateBoxing(int count = 1000000)</w:t>
       </w:r>
     </w:p>
     <w:p>
       <w:pPr>
-        <w:spacing w:line="240" w:lineRule="auto"/>
-      </w:pPr>
-      <w:r>
-        <w:rPr>
-          <w:i/>
-          <w:sz w:val="24"/>
-        </w:rPr>
+        <w:pStyle w:val="Listing"/>
+      </w:pPr>
+      <w:r>
         <w:t xml:space="preserve">    {</w:t>
       </w:r>
     </w:p>
     <w:p>
       <w:pPr>
-        <w:spacing w:line="240" w:lineRule="auto"/>
-      </w:pPr>
-      <w:r>
-        <w:rPr>
-          <w:i/>
-          <w:sz w:val="24"/>
-        </w:rPr>
+        <w:pStyle w:val="Listing"/>
+      </w:pPr>
+      <w:r>
         <w:t xml:space="preserve">        var list = new List&lt;object&gt;();</w:t>
       </w:r>
     </w:p>
     <w:p>
       <w:pPr>
-        <w:spacing w:line="240" w:lineRule="auto"/>
-      </w:pPr>
-      <w:r>
-        <w:rPr>
-          <w:i/>
-          <w:sz w:val="24"/>
-        </w:rPr>
+        <w:pStyle w:val="Listing"/>
+      </w:pPr>
+      <w:r>
         <w:t xml:space="preserve">        for (int i = 0; i &lt; count; i++)</w:t>
       </w:r>
     </w:p>
     <w:p>
       <w:pPr>
-        <w:spacing w:line="240" w:lineRule="auto"/>
-      </w:pPr>
-      <w:r>
-        <w:rPr>
-          <w:i/>
-          <w:sz w:val="24"/>
-        </w:rPr>
+        <w:pStyle w:val="Listing"/>
+      </w:pPr>
+      <w:r>
         <w:t xml:space="preserve">        {</w:t>
       </w:r>
     </w:p>
     <w:p>
       <w:pPr>
-        <w:spacing w:line="240" w:lineRule="auto"/>
-      </w:pPr>
-      <w:r>
-        <w:rPr>
-          <w:i/>
-          <w:sz w:val="24"/>
-        </w:rPr>
+        <w:pStyle w:val="Listing"/>
+      </w:pPr>
+      <w:r>
         <w:t xml:space="preserve">            list.Add(i); // Упаковка</w:t>
       </w:r>
     </w:p>
     <w:p>
       <w:pPr>
-        <w:spacing w:line="240" w:lineRule="auto"/>
-      </w:pPr>
-      <w:r>
-        <w:rPr>
-          <w:i/>
-          <w:sz w:val="24"/>
-        </w:rPr>
+        <w:pStyle w:val="Listing"/>
+      </w:pPr>
+      <w:r>
         <w:t xml:space="preserve">        }</w:t>
       </w:r>
     </w:p>
     <w:p>
       <w:pPr>
-        <w:spacing w:line="240" w:lineRule="auto"/>
-      </w:pPr>
-      <w:r>
-        <w:rPr>
-          <w:i/>
-          <w:sz w:val="24"/>
-        </w:rPr>
+        <w:pStyle w:val="Listing"/>
+      </w:pPr>
+      <w:r>
         <w:t xml:space="preserve">    }</w:t>
       </w:r>
     </w:p>
     <w:p>
       <w:pPr>
-        <w:spacing w:line="240" w:lineRule="auto"/>
-      </w:pPr>
-    </w:p>
-    <w:p>
-      <w:pPr>
-        <w:spacing w:line="240" w:lineRule="auto"/>
-      </w:pPr>
-      <w:r>
-        <w:rPr>
-          <w:i/>
-          <w:sz w:val="24"/>
-        </w:rPr>
+        <w:pStyle w:val="Listing"/>
+      </w:pPr>
+    </w:p>
+    <w:p>
+      <w:pPr>
+        <w:pStyle w:val="Listing"/>
+      </w:pPr>
+      <w:r>
         <w:t xml:space="preserve">    public void PrintMemoryInfo(string message = "")</w:t>
       </w:r>
     </w:p>
     <w:p>
       <w:pPr>
-        <w:spacing w:line="240" w:lineRule="auto"/>
-      </w:pPr>
-      <w:r>
-        <w:rPr>
-          <w:i/>
-          <w:sz w:val="24"/>
-        </w:rPr>
+        <w:pStyle w:val="Listing"/>
+      </w:pPr>
+      <w:r>
         <w:t xml:space="preserve">    {</w:t>
       </w:r>
     </w:p>
     <w:p>
       <w:pPr>
-        <w:spacing w:line="240" w:lineRule="auto"/>
-      </w:pPr>
-      <w:r>
-        <w:rPr>
-          <w:i/>
-          <w:sz w:val="24"/>
-        </w:rPr>
+        <w:pStyle w:val="Listing"/>
+      </w:pPr>
+      <w:r>
         <w:t xml:space="preserve">        if (!string.IsNullOrEmpty(message))</w:t>
       </w:r>
     </w:p>
     <w:p>
       <w:pPr>
-        <w:spacing w:line="240" w:lineRule="auto"/>
-      </w:pPr>
-      <w:r>
-        <w:rPr>
-          <w:i/>
-          <w:sz w:val="24"/>
-        </w:rPr>
+        <w:pStyle w:val="Listing"/>
+      </w:pPr>
+      <w:r>
         <w:t xml:space="preserve">            Console.WriteLine($"\n=== {message} ===");</w:t>
       </w:r>
     </w:p>
     <w:p>
       <w:pPr>
-        <w:spacing w:line="240" w:lineRule="auto"/>
-      </w:pPr>
-    </w:p>
-    <w:p>
-      <w:pPr>
-        <w:spacing w:line="240" w:lineRule="auto"/>
-      </w:pPr>
-      <w:r>
-        <w:rPr>
-          <w:i/>
-          <w:sz w:val="24"/>
-        </w:rPr>
-        <w:t xml:space="preserve">        </w:t>
-      </w:r>
-      <w:r>
-        <w:rPr>
-          <w:i/>
-          <w:sz w:val="24"/>
-        </w:rPr>
-        <w:t>Console.WriteLine($"GC Generation: {GC.GetGeneration(this)}");</w:t>
-      </w:r>
-    </w:p>
-    <w:p>
-      <w:pPr>
-        <w:spacing w:line="240" w:lineRule="auto"/>
-      </w:pPr>
-      <w:r>
-        <w:rPr>
-          <w:i/>
-          <w:sz w:val="24"/>
-        </w:rPr>
+        <w:pStyle w:val="Listing"/>
+      </w:pPr>
+    </w:p>
+    <w:p>
+      <w:pPr>
+        <w:pStyle w:val="Listing"/>
+      </w:pPr>
+      <w:r>
+        <w:t xml:space="preserve">        Console.WriteLine($"GC Generation: {GC.GetGeneration(this)}");</w:t>
+      </w:r>
+    </w:p>
+    <w:p>
+      <w:pPr>
+        <w:pStyle w:val="Listing"/>
+      </w:pPr>
+      <w:r>
         <w:t xml:space="preserve">        Console.WriteLine($"Total Memory: {GC.GetTotalMemory(false) / (1024 * 1024)} MB");</w:t>
       </w:r>
     </w:p>
     <w:p>
       <w:pPr>
-        <w:spacing w:line="240" w:lineRule="auto"/>
-      </w:pPr>
-      <w:r>
-        <w:rPr>
-          <w:i/>
-          <w:sz w:val="24"/>
-        </w:rPr>
+        <w:pStyle w:val="Listing"/>
+      </w:pPr>
+      <w:r>
         <w:t xml:space="preserve">        Console.WriteLine($"Collection Count Gen0: {GC.CollectionCount(0)}");</w:t>
       </w:r>
     </w:p>
     <w:p>
       <w:pPr>
-        <w:spacing w:line="240" w:lineRule="auto"/>
-      </w:pPr>
-      <w:r>
-        <w:rPr>
-          <w:i/>
-          <w:sz w:val="24"/>
-        </w:rPr>
+        <w:pStyle w:val="Listing"/>
+      </w:pPr>
+      <w:r>
         <w:t xml:space="preserve">        Console.WriteLine($"Collection Count Gen1: {GC.CollectionCount(1)}");</w:t>
       </w:r>
     </w:p>
     <w:p>
       <w:pPr>
-        <w:spacing w:line="240" w:lineRule="auto"/>
-      </w:pPr>
-      <w:r>
-        <w:rPr>
-          <w:i/>
-          <w:sz w:val="24"/>
-        </w:rPr>
+        <w:pStyle w:val="Listing"/>
+      </w:pPr>
+      <w:r>
         <w:t xml:space="preserve">        Console.WriteLine($"Collection Count Gen2: {GC.CollectionCount(2)}");</w:t>
       </w:r>
     </w:p>
     <w:p>
       <w:pPr>
-        <w:spacing w:line="240" w:lineRule="auto"/>
-      </w:pPr>
-    </w:p>
-    <w:p>
-      <w:pPr>
-        <w:spacing w:line="240" w:lineRule="auto"/>
-      </w:pPr>
-      <w:r>
-        <w:rPr>
-          <w:i/>
-          <w:sz w:val="24"/>
-        </w:rPr>
+        <w:pStyle w:val="Listing"/>
+      </w:pPr>
+    </w:p>
+    <w:p>
+      <w:pPr>
+        <w:pStyle w:val="Listing"/>
+      </w:pPr>
+      <w:r>
         <w:t xml:space="preserve">        using (Process process = Process.GetCurrentProcess())</w:t>
       </w:r>
     </w:p>
     <w:p>
       <w:pPr>
-        <w:spacing w:line="240" w:lineRule="auto"/>
-      </w:pPr>
-      <w:r>
-        <w:rPr>
-          <w:i/>
-          <w:sz w:val="24"/>
-        </w:rPr>
+        <w:pStyle w:val="Listing"/>
+      </w:pPr>
+      <w:r>
         <w:t xml:space="preserve">        {</w:t>
       </w:r>
     </w:p>
     <w:p>
       <w:pPr>
-        <w:spacing w:line="240" w:lineRule="auto"/>
-      </w:pPr>
-      <w:r>
-        <w:rPr>
-          <w:i/>
-          <w:sz w:val="24"/>
-        </w:rPr>
-        <w:t xml:space="preserve">            Console.WriteLine($"Working Set: {</w:t>
-      </w:r>
-      <w:r>
-        <w:rPr>
-          <w:i/>
-          <w:sz w:val="24"/>
-        </w:rPr>
-        <w:t>process.WorkingSet64 / (1024 * 1024)} MB");</w:t>
-      </w:r>
-    </w:p>
-    <w:p>
-      <w:pPr>
-        <w:spacing w:line="240" w:lineRule="auto"/>
-      </w:pPr>
-      <w:r>
-        <w:rPr>
-          <w:i/>
-          <w:sz w:val="24"/>
-        </w:rPr>
+        <w:pStyle w:val="Listing"/>
+      </w:pPr>
+      <w:r>
+        <w:t xml:space="preserve">            Console.WriteLine($"Working Set: {process.WorkingSet64 / (1024 * 1024)} MB");</w:t>
+      </w:r>
+    </w:p>
+    <w:p>
+      <w:pPr>
+        <w:pStyle w:val="Listing"/>
+      </w:pPr>
+      <w:r>
         <w:t xml:space="preserve">        }</w:t>
       </w:r>
     </w:p>
     <w:p>
       <w:pPr>
-        <w:spacing w:line="240" w:lineRule="auto"/>
-      </w:pPr>
-      <w:r>
-        <w:rPr>
-          <w:i/>
-          <w:sz w:val="24"/>
-        </w:rPr>
+        <w:pStyle w:val="Listing"/>
+      </w:pPr>
+      <w:r>
         <w:t xml:space="preserve">    }</w:t>
       </w:r>
     </w:p>
     <w:p>
       <w:pPr>
-        <w:spacing w:line="240" w:lineRule="auto"/>
-      </w:pPr>
-    </w:p>
-    <w:p>
-      <w:pPr>
-        <w:spacing w:line="240" w:lineRule="auto"/>
-      </w:pPr>
-      <w:r>
-        <w:rPr>
-          <w:i/>
-          <w:sz w:val="24"/>
-        </w:rPr>
+        <w:pStyle w:val="Listing"/>
+      </w:pPr>
+    </w:p>
+    <w:p>
+      <w:pPr>
+        <w:pStyle w:val="Listing"/>
+      </w:pPr>
+      <w:r>
         <w:t xml:space="preserve">    public void Cleanup()</w:t>
       </w:r>
     </w:p>
     <w:p>
       <w:pPr>
-        <w:spacing w:line="240" w:lineRule="auto"/>
-      </w:pPr>
-      <w:r>
-        <w:rPr>
-          <w:i/>
-          <w:sz w:val="24"/>
-        </w:rPr>
+        <w:pStyle w:val="Listing"/>
+      </w:pPr>
+      <w:r>
         <w:t xml:space="preserve">    {</w:t>
       </w:r>
     </w:p>
     <w:p>
       <w:pPr>
-        <w:spacing w:line="240" w:lineRule="auto"/>
-      </w:pPr>
-      <w:r>
-        <w:rPr>
-          <w:i/>
-          <w:sz w:val="24"/>
-        </w:rPr>
+        <w:pStyle w:val="Listing"/>
+      </w:pPr>
+      <w:r>
         <w:t xml:space="preserve">        _allocatedMemory.Clear();</w:t>
       </w:r>
     </w:p>
     <w:p>
       <w:pPr>
-        <w:spacing w:line="240" w:lineRule="auto"/>
-      </w:pPr>
-      <w:r>
-        <w:rPr>
-          <w:i/>
-          <w:sz w:val="24"/>
-        </w:rPr>
+        <w:pStyle w:val="Listing"/>
+      </w:pPr>
+      <w:r>
         <w:t xml:space="preserve">        GC.Collect();</w:t>
       </w:r>
     </w:p>
     <w:p>
       <w:pPr>
-        <w:spacing w:line="240" w:lineRule="auto"/>
-      </w:pPr>
-      <w:r>
-        <w:rPr>
-          <w:i/>
-          <w:sz w:val="24"/>
-        </w:rPr>
+        <w:pStyle w:val="Listing"/>
+      </w:pPr>
+      <w:r>
         <w:t xml:space="preserve">        GC.WaitForPendingFinalizers();</w:t>
       </w:r>
     </w:p>
     <w:p>
       <w:pPr>
-        <w:spacing w:line="240" w:lineRule="auto"/>
-      </w:pPr>
-      <w:r>
-        <w:rPr>
-          <w:i/>
-          <w:sz w:val="24"/>
-        </w:rPr>
+        <w:pStyle w:val="Listing"/>
+      </w:pPr>
+      <w:r>
         <w:t xml:space="preserve">    }</w:t>
       </w:r>
     </w:p>
     <w:p>
       <w:pPr>
-        <w:spacing w:line="240" w:lineRule="auto"/>
-      </w:pPr>
-    </w:p>
-    <w:p>
-      <w:pPr>
-        <w:spacing w:line="240" w:lineRule="auto"/>
-      </w:pPr>
-      <w:r>
-        <w:rPr>
-          <w:i/>
-          <w:sz w:val="24"/>
-        </w:rPr>
+        <w:pStyle w:val="Listing"/>
+      </w:pPr>
+    </w:p>
+    <w:p>
+      <w:pPr>
+        <w:pStyle w:val="Listing"/>
+      </w:pPr>
+      <w:r>
         <w:t xml:space="preserve">    public void Dispose()</w:t>
       </w:r>
     </w:p>
     <w:p>
       <w:pPr>
-        <w:spacing w:line="240" w:lineRule="auto"/>
-      </w:pPr>
-      <w:r>
-        <w:rPr>
-          <w:i/>
-          <w:sz w:val="24"/>
-        </w:rPr>
+        <w:pStyle w:val="Listing"/>
+      </w:pPr>
+      <w:r>
         <w:t xml:space="preserve">    {</w:t>
       </w:r>
     </w:p>
     <w:p>
       <w:pPr>
-        <w:spacing w:line="240" w:lineRule="auto"/>
-      </w:pPr>
-      <w:r>
-        <w:rPr>
-          <w:i/>
-          <w:sz w:val="24"/>
-        </w:rPr>
+        <w:pStyle w:val="Listing"/>
+      </w:pPr>
+      <w:r>
         <w:t xml:space="preserve">        if (!_disposed)</w:t>
       </w:r>
     </w:p>
     <w:p>
       <w:pPr>
-        <w:spacing w:line="240" w:lineRule="auto"/>
-      </w:pPr>
-      <w:r>
-        <w:rPr>
-          <w:i/>
-          <w:sz w:val="24"/>
-        </w:rPr>
+        <w:pStyle w:val="Listing"/>
+      </w:pPr>
+      <w:r>
         <w:t xml:space="preserve">        {</w:t>
       </w:r>
     </w:p>
     <w:p>
       <w:pPr>
-        <w:spacing w:line="240" w:lineRule="auto"/>
-      </w:pPr>
-      <w:r>
-        <w:rPr>
-          <w:i/>
-          <w:sz w:val="24"/>
-        </w:rPr>
+        <w:pStyle w:val="Listing"/>
+      </w:pPr>
+      <w:r>
         <w:t xml:space="preserve">            Cleanup();</w:t>
       </w:r>
     </w:p>
     <w:p>
       <w:pPr>
-        <w:spacing w:line="240" w:lineRule="auto"/>
-      </w:pPr>
-      <w:r>
-        <w:rPr>
-          <w:i/>
-          <w:sz w:val="24"/>
-        </w:rPr>
+        <w:pStyle w:val="Listing"/>
+      </w:pPr>
+      <w:r>
         <w:t xml:space="preserve">            _disposed = true;</w:t>
       </w:r>
     </w:p>
     <w:p>
       <w:pPr>
-        <w:spacing w:line="240" w:lineRule="auto"/>
-      </w:pPr>
-      <w:r>
-        <w:rPr>
-          <w:i/>
-          <w:sz w:val="24"/>
-        </w:rPr>
+        <w:pStyle w:val="Listing"/>
+      </w:pPr>
+      <w:r>
         <w:t xml:space="preserve">        }</w:t>
       </w:r>
     </w:p>
     <w:p>
       <w:pPr>
-        <w:spacing w:line="240" w:lineRule="auto"/>
-      </w:pPr>
-      <w:r>
-        <w:rPr>
-          <w:i/>
-          <w:sz w:val="24"/>
-        </w:rPr>
+        <w:pStyle w:val="Listing"/>
+      </w:pPr>
+      <w:r>
         <w:t xml:space="preserve">    }</w:t>
       </w:r>
     </w:p>
     <w:p>
       <w:pPr>
-        <w:spacing w:line="240" w:lineRule="auto"/>
-      </w:pPr>
-      <w:r>
-        <w:rPr>
-          <w:i/>
-          <w:sz w:val="24"/>
-        </w:rPr>
-        <w:lastRenderedPageBreak/>
+        <w:pStyle w:val="Listing"/>
+      </w:pPr>
+      <w:r>
         <w:t>}</w:t>
       </w:r>
     </w:p>
@@ -3755,6 +3438,7 @@
         <w:jc w:val="both"/>
       </w:pPr>
       <w:r>
+        <w:lastRenderedPageBreak/>
         <w:t xml:space="preserve">Тестовая программа (задание 3) создает объект в операторе </w:t>
       </w:r>
       <w:r>
@@ -3787,7 +3471,7 @@
           <w:noProof/>
         </w:rPr>
         <w:drawing>
-          <wp:inline distT="0" distB="0" distL="0" distR="0" wp14:anchorId="4DE9C2A3" wp14:editId="1BDCC1F5">
+          <wp:inline distT="0" distB="0" distL="0" distR="0" wp14:anchorId="239E3F01" wp14:editId="08E3CEFA">
             <wp:extent cx="5580000" cy="4377320"/>
             <wp:effectExtent l="0" t="0" r="0" b="0"/>
             <wp:docPr id="4" name="Picture 4"/>
@@ -3845,7 +3529,7 @@
         <w:jc w:val="both"/>
       </w:pPr>
       <w:r>
-        <w:t xml:space="preserve">После выделения 10 МБ и объектов </w:t>
+        <w:t xml:space="preserve">После выделения 10 МБ объем управляемой памяти составил 14 МБ, после создания объектов </w:t>
       </w:r>
       <w:r>
         <w:rPr>
@@ -3854,7 +3538,7 @@
         <w:t>LOH</w:t>
       </w:r>
       <w:r>
-        <w:t xml:space="preserve"> объем управляемой памяти вырос с 14 до 22 МБ. После принудительной сборки показание упало до 0 МБ. Упаковка заняла 170 мс, версия без упаковки – 11 мс.</w:t>
+        <w:t xml:space="preserve"> – 12 МБ, так как часть объектов без ссылок уже собрал сборщик. После принудительной сборки показание упало до 0 МБ. Упаковка заняла 81 мс, версия без упаковки – 6 мс.</w:t>
       </w:r>
     </w:p>
     <w:p>
@@ -3863,7 +3547,7 @@
         <w:spacing w:before="360"/>
         <w:ind w:firstLine="709"/>
       </w:pPr>
-      <w:bookmarkStart w:id="7" w:name="_Toc242378568"/>
+      <w:bookmarkStart w:id="7" w:name="_Toc242385949"/>
       <w:r>
         <w:rPr>
           <w:rFonts w:ascii="Times New Roman" w:hAnsi="Times New Roman"/>
@@ -3905,11 +3589,7 @@
         <w:t>LOH</w:t>
       </w:r>
       <w:r>
-        <w:t xml:space="preserve"> по 100 КБ), после отписки и очистки списка. На каждой </w:t>
-      </w:r>
-      <w:r>
-        <w:lastRenderedPageBreak/>
-        <w:t xml:space="preserve">паузе командой </w:t>
+        <w:t xml:space="preserve"> по 100 КБ), после отписки и очистки списка. На каждой паузе командой </w:t>
       </w:r>
       <w:r>
         <w:rPr>
@@ -3931,9 +3611,10 @@
         <w:rPr>
           <w:noProof/>
         </w:rPr>
+        <w:lastRenderedPageBreak/>
         <w:drawing>
-          <wp:inline distT="0" distB="0" distL="0" distR="0" wp14:anchorId="7F098634" wp14:editId="2B6E6D8E">
-            <wp:extent cx="5580000" cy="2427789"/>
+          <wp:inline distT="0" distB="0" distL="0" distR="0" wp14:anchorId="2687F67B" wp14:editId="4907A639">
+            <wp:extent cx="5580000" cy="2662737"/>
             <wp:effectExtent l="0" t="0" r="0" b="0"/>
             <wp:docPr id="5" name="Picture 5"/>
             <wp:cNvGraphicFramePr>
@@ -3955,7 +3636,7 @@
                   <pic:spPr>
                     <a:xfrm>
                       <a:off x="0" y="0"/>
-                      <a:ext cx="5580000" cy="2427789"/>
+                      <a:ext cx="5580000" cy="2662737"/>
                     </a:xfrm>
                     <a:prstGeom prst="rect">
                       <a:avLst/>
@@ -3984,7 +3665,7 @@
         <w:jc w:val="both"/>
       </w:pPr>
       <w:r>
-        <w:t xml:space="preserve">В начальном состоянии управляемая куча занимает 337 002 байта и содержит 4010 объектов; крупных массивов </w:t>
+        <w:t xml:space="preserve">В начальном состоянии управляемая куча занимает 326 352 байта и содержит 4026 объектов; крупных массивов </w:t>
       </w:r>
       <w:r>
         <w:rPr>
@@ -4028,8 +3709,8 @@
           <w:noProof/>
         </w:rPr>
         <w:drawing>
-          <wp:inline distT="0" distB="0" distL="0" distR="0" wp14:anchorId="466DB362" wp14:editId="7987856C">
-            <wp:extent cx="5580000" cy="2310316"/>
+          <wp:inline distT="0" distB="0" distL="0" distR="0" wp14:anchorId="4580B4DE" wp14:editId="75A79285">
+            <wp:extent cx="5580000" cy="2545263"/>
             <wp:effectExtent l="0" t="0" r="0" b="0"/>
             <wp:docPr id="6" name="Picture 6"/>
             <wp:cNvGraphicFramePr>
@@ -4051,7 +3732,7 @@
                   <pic:spPr>
                     <a:xfrm>
                       <a:off x="0" y="0"/>
-                      <a:ext cx="5580000" cy="2310316"/>
+                      <a:ext cx="5580000" cy="2545263"/>
                     </a:xfrm>
                     <a:prstGeom prst="rect">
                       <a:avLst/>
@@ -4086,7 +3767,7 @@
         <w:jc w:val="both"/>
       </w:pPr>
       <w:r>
-        <w:t xml:space="preserve">Куча выросла до 31 084 034 байт и 5058 объектов. В отчете видны 200 массивов </w:t>
+        <w:t xml:space="preserve">Куча выросла до 31 073 630 байт и 5077 объектов. В отчете видны 200 массивов </w:t>
       </w:r>
       <w:r>
         <w:rPr>
@@ -4128,8 +3809,8 @@
         </w:rPr>
         <w:lastRenderedPageBreak/>
         <w:drawing>
-          <wp:inline distT="0" distB="0" distL="0" distR="0" wp14:anchorId="5F1683BB" wp14:editId="7DC894BE">
-            <wp:extent cx="5580000" cy="2310316"/>
+          <wp:inline distT="0" distB="0" distL="0" distR="0" wp14:anchorId="38ACEB68" wp14:editId="5CCFCE9E">
+            <wp:extent cx="5580000" cy="2545263"/>
             <wp:effectExtent l="0" t="0" r="0" b="0"/>
             <wp:docPr id="7" name="Picture 7"/>
             <wp:cNvGraphicFramePr>
@@ -4151,7 +3832,7 @@
                   <pic:spPr>
                     <a:xfrm>
                       <a:off x="0" y="0"/>
-                      <a:ext cx="5580000" cy="2310316"/>
+                      <a:ext cx="5580000" cy="2545263"/>
                     </a:xfrm>
                     <a:prstGeom prst="rect">
                       <a:avLst/>
@@ -4180,7 +3861,7 @@
         <w:jc w:val="both"/>
       </w:pPr>
       <w:r>
-        <w:t>Куча уменьшилась до 10 691 746 байт. Остался один массив около 100 КБ, а 1000 массивов по 10 КБ сохранились: на них ссылается статический список, который не очищался. Сравнение снимков подтверждает, что отписка от события и очистка списка освободили память, а статическая ссылка ее удерживает.</w:t>
+        <w:t>Куча уменьшилась до 10 681 342 байт. Остался один массив около 100 КБ, а 1000 массивов по 10 КБ сохранились: на них ссылается статический список, который не очищался. Сравнение снимков подтверждает, что отписка от события и очистка списка освободили память, а статическая ссылка ее удерживает.</w:t>
       </w:r>
     </w:p>
     <w:p>
@@ -4189,7 +3870,7 @@
         <w:spacing w:before="360"/>
         <w:ind w:firstLine="709"/>
       </w:pPr>
-      <w:bookmarkStart w:id="8" w:name="_Toc242378569"/>
+      <w:bookmarkStart w:id="8" w:name="_Toc242385950"/>
       <w:r>
         <w:rPr>
           <w:rFonts w:ascii="Times New Roman" w:hAnsi="Times New Roman"/>
@@ -4321,492 +4002,323 @@
     </w:p>
     <w:p>
       <w:pPr>
-        <w:spacing w:line="240" w:lineRule="auto"/>
-      </w:pPr>
-      <w:r>
-        <w:rPr>
-          <w:i/>
-          <w:sz w:val="24"/>
-        </w:rPr>
+        <w:pStyle w:val="Listing"/>
+      </w:pPr>
+      <w:r>
         <w:t>public class StaticLeakDemo</w:t>
       </w:r>
     </w:p>
     <w:p>
       <w:pPr>
-        <w:spacing w:line="240" w:lineRule="auto"/>
-      </w:pPr>
-      <w:r>
-        <w:rPr>
-          <w:i/>
-          <w:sz w:val="24"/>
-        </w:rPr>
+        <w:pStyle w:val="Listing"/>
+      </w:pPr>
+      <w:r>
         <w:t>{</w:t>
       </w:r>
     </w:p>
     <w:p>
       <w:pPr>
-        <w:spacing w:line="240" w:lineRule="auto"/>
-      </w:pPr>
-      <w:r>
-        <w:rPr>
-          <w:i/>
-          <w:sz w:val="24"/>
-        </w:rPr>
+        <w:pStyle w:val="Listing"/>
+      </w:pPr>
+      <w:r>
         <w:t xml:space="preserve">    private static List&lt;byte[]&gt; _staticList = new List&lt;byte[]&gt;();</w:t>
       </w:r>
     </w:p>
     <w:p>
       <w:pPr>
-        <w:spacing w:line="240" w:lineRule="auto"/>
-      </w:pPr>
-    </w:p>
-    <w:p>
-      <w:pPr>
-        <w:spacing w:line="240" w:lineRule="auto"/>
-      </w:pPr>
-      <w:r>
-        <w:rPr>
-          <w:i/>
-          <w:sz w:val="24"/>
-        </w:rPr>
+        <w:pStyle w:val="Listing"/>
+      </w:pPr>
+    </w:p>
+    <w:p>
+      <w:pPr>
+        <w:pStyle w:val="Listing"/>
+      </w:pPr>
+      <w:r>
         <w:t xml:space="preserve">    // Добавляет 1000 объектов по 10KB в статический список</w:t>
       </w:r>
     </w:p>
     <w:p>
       <w:pPr>
-        <w:spacing w:line="240" w:lineRule="auto"/>
-      </w:pPr>
-      <w:r>
-        <w:rPr>
-          <w:i/>
-          <w:sz w:val="24"/>
-        </w:rPr>
+        <w:pStyle w:val="Listing"/>
+      </w:pPr>
+      <w:r>
         <w:t xml:space="preserve">    public static void AddData()</w:t>
       </w:r>
     </w:p>
     <w:p>
       <w:pPr>
-        <w:spacing w:line="240" w:lineRule="auto"/>
-      </w:pPr>
-      <w:r>
-        <w:rPr>
-          <w:i/>
-          <w:sz w:val="24"/>
-        </w:rPr>
+        <w:pStyle w:val="Listing"/>
+      </w:pPr>
+      <w:r>
         <w:t xml:space="preserve">    {</w:t>
       </w:r>
     </w:p>
     <w:p>
       <w:pPr>
-        <w:spacing w:line="240" w:lineRule="auto"/>
-      </w:pPr>
-      <w:r>
-        <w:rPr>
-          <w:i/>
-          <w:sz w:val="24"/>
-        </w:rPr>
-        <w:t xml:space="preserve">        for (int i</w:t>
-      </w:r>
-      <w:r>
-        <w:rPr>
-          <w:i/>
-          <w:sz w:val="24"/>
-        </w:rPr>
-        <w:t xml:space="preserve"> = 0; i &lt; 1000; i++)</w:t>
-      </w:r>
-    </w:p>
-    <w:p>
-      <w:pPr>
-        <w:spacing w:line="240" w:lineRule="auto"/>
-      </w:pPr>
-      <w:r>
-        <w:rPr>
-          <w:i/>
-          <w:sz w:val="24"/>
-        </w:rPr>
+        <w:pStyle w:val="Listing"/>
+      </w:pPr>
+      <w:r>
+        <w:t xml:space="preserve">        for (int i = 0; i &lt; 1000; i++)</w:t>
+      </w:r>
+    </w:p>
+    <w:p>
+      <w:pPr>
+        <w:pStyle w:val="Listing"/>
+      </w:pPr>
+      <w:r>
         <w:t xml:space="preserve">            _staticList.Add(new byte[1024 * 10]);</w:t>
       </w:r>
     </w:p>
     <w:p>
       <w:pPr>
-        <w:spacing w:line="240" w:lineRule="auto"/>
-      </w:pPr>
-      <w:r>
-        <w:rPr>
-          <w:i/>
-          <w:sz w:val="24"/>
-        </w:rPr>
+        <w:pStyle w:val="Listing"/>
+      </w:pPr>
+      <w:r>
         <w:t xml:space="preserve">    }</w:t>
       </w:r>
     </w:p>
     <w:p>
       <w:pPr>
-        <w:spacing w:line="240" w:lineRule="auto"/>
-      </w:pPr>
-    </w:p>
-    <w:p>
-      <w:pPr>
-        <w:spacing w:line="240" w:lineRule="auto"/>
-      </w:pPr>
-      <w:r>
-        <w:rPr>
-          <w:i/>
-          <w:sz w:val="24"/>
-        </w:rPr>
+        <w:pStyle w:val="Listing"/>
+      </w:pPr>
+    </w:p>
+    <w:p>
+      <w:pPr>
+        <w:pStyle w:val="Listing"/>
+      </w:pPr>
+      <w:r>
         <w:t xml:space="preserve">    public static void CheckMemory()</w:t>
       </w:r>
     </w:p>
     <w:p>
       <w:pPr>
-        <w:spacing w:line="240" w:lineRule="auto"/>
-      </w:pPr>
-      <w:r>
-        <w:rPr>
-          <w:i/>
-          <w:sz w:val="24"/>
-        </w:rPr>
+        <w:pStyle w:val="Listing"/>
+      </w:pPr>
+      <w:r>
         <w:t xml:space="preserve">    {</w:t>
       </w:r>
     </w:p>
     <w:p>
       <w:pPr>
-        <w:spacing w:line="240" w:lineRule="auto"/>
-      </w:pPr>
-      <w:r>
-        <w:rPr>
-          <w:i/>
-          <w:sz w:val="24"/>
-        </w:rPr>
+        <w:pStyle w:val="Listing"/>
+      </w:pPr>
+      <w:r>
+        <w:lastRenderedPageBreak/>
         <w:t xml:space="preserve">        Console.WriteLine($"  Текущий размер памяти: {GC.GetTotalMemory(false) / 1024} KB");</w:t>
       </w:r>
     </w:p>
     <w:p>
       <w:pPr>
-        <w:spacing w:line="240" w:lineRule="auto"/>
-      </w:pPr>
-      <w:r>
-        <w:rPr>
-          <w:i/>
-          <w:sz w:val="24"/>
-        </w:rPr>
-        <w:lastRenderedPageBreak/>
+        <w:pStyle w:val="Listing"/>
+      </w:pPr>
+      <w:r>
         <w:t xml:space="preserve">        Console.WriteLine($"  Количество объектов в статическом списке: {_staticList.Count}");</w:t>
       </w:r>
     </w:p>
     <w:p>
       <w:pPr>
-        <w:spacing w:line="240" w:lineRule="auto"/>
-      </w:pPr>
-      <w:r>
-        <w:rPr>
-          <w:i/>
-          <w:sz w:val="24"/>
-        </w:rPr>
+        <w:pStyle w:val="Listing"/>
+      </w:pPr>
+      <w:r>
         <w:t xml:space="preserve">        Console.WriteLine($"  Поколение статического списка: {GC.GetGeneration(_staticList)}");</w:t>
       </w:r>
     </w:p>
     <w:p>
       <w:pPr>
-        <w:spacing w:line="240" w:lineRule="auto"/>
-      </w:pPr>
-      <w:r>
-        <w:rPr>
-          <w:i/>
-          <w:sz w:val="24"/>
-        </w:rPr>
+        <w:pStyle w:val="Listing"/>
+      </w:pPr>
+      <w:r>
         <w:t xml:space="preserve">    }</w:t>
       </w:r>
     </w:p>
     <w:p>
       <w:pPr>
-        <w:spacing w:line="240" w:lineRule="auto"/>
-      </w:pPr>
-      <w:r>
-        <w:rPr>
-          <w:i/>
-          <w:sz w:val="24"/>
-        </w:rPr>
+        <w:pStyle w:val="Listing"/>
+      </w:pPr>
+      <w:r>
         <w:t>}</w:t>
       </w:r>
     </w:p>
     <w:p>
       <w:pPr>
-        <w:spacing w:line="240" w:lineRule="auto"/>
-      </w:pPr>
-    </w:p>
-    <w:p>
-      <w:pPr>
-        <w:spacing w:line="240" w:lineRule="auto"/>
-      </w:pPr>
-      <w:r>
-        <w:rPr>
-          <w:i/>
-          <w:sz w:val="24"/>
-        </w:rPr>
+        <w:pStyle w:val="Listing"/>
+      </w:pPr>
+    </w:p>
+    <w:p>
+      <w:pPr>
+        <w:pStyle w:val="Listing"/>
+      </w:pPr>
+      <w:r>
         <w:t>// Событийная утечка</w:t>
       </w:r>
     </w:p>
     <w:p>
       <w:pPr>
-        <w:spacing w:line="240" w:lineRule="auto"/>
-      </w:pPr>
-      <w:r>
-        <w:rPr>
-          <w:i/>
-          <w:sz w:val="24"/>
-        </w:rPr>
+        <w:pStyle w:val="Listing"/>
+      </w:pPr>
+      <w:r>
         <w:t>public class EventLeakDemo</w:t>
       </w:r>
     </w:p>
     <w:p>
       <w:pPr>
-        <w:spacing w:line="240" w:lineRule="auto"/>
-      </w:pPr>
-      <w:r>
-        <w:rPr>
-          <w:i/>
-          <w:sz w:val="24"/>
-        </w:rPr>
+        <w:pStyle w:val="Listing"/>
+      </w:pPr>
+      <w:r>
         <w:t>{</w:t>
       </w:r>
     </w:p>
     <w:p>
       <w:pPr>
-        <w:spacing w:line="240" w:lineRule="auto"/>
-      </w:pPr>
-      <w:r>
-        <w:rPr>
-          <w:i/>
-          <w:sz w:val="24"/>
-        </w:rPr>
+        <w:pStyle w:val="Listing"/>
+      </w:pPr>
+      <w:r>
         <w:t xml:space="preserve">    public event EventHandler? DemoEvent;</w:t>
       </w:r>
     </w:p>
     <w:p>
       <w:pPr>
-        <w:spacing w:line="240" w:lineRule="auto"/>
-      </w:pPr>
-      <w:r>
-        <w:rPr>
-          <w:i/>
-          <w:sz w:val="24"/>
-        </w:rPr>
-        <w:t xml:space="preserve">    </w:t>
-      </w:r>
-      <w:r>
-        <w:rPr>
-          <w:i/>
-          <w:sz w:val="24"/>
-        </w:rPr>
-        <w:t>private List&lt;EventHandler&gt; _handlers = new List&lt;EventHandler&gt;();</w:t>
-      </w:r>
-    </w:p>
-    <w:p>
-      <w:pPr>
-        <w:spacing w:line="240" w:lineRule="auto"/>
-      </w:pPr>
-    </w:p>
-    <w:p>
-      <w:pPr>
-        <w:spacing w:line="240" w:lineRule="auto"/>
-      </w:pPr>
-      <w:r>
-        <w:rPr>
-          <w:i/>
-          <w:sz w:val="24"/>
-        </w:rPr>
+        <w:pStyle w:val="Listing"/>
+      </w:pPr>
+      <w:r>
+        <w:t xml:space="preserve">    private List&lt;EventHandler&gt; _handlers = new List&lt;EventHandler&gt;();</w:t>
+      </w:r>
+    </w:p>
+    <w:p>
+      <w:pPr>
+        <w:pStyle w:val="Listing"/>
+      </w:pPr>
+    </w:p>
+    <w:p>
+      <w:pPr>
+        <w:pStyle w:val="Listing"/>
+      </w:pPr>
+      <w:r>
         <w:t xml:space="preserve">    // Подписка на событие; большой объект создаётся в обработчике и живёт, пока есть подписка</w:t>
       </w:r>
     </w:p>
     <w:p>
       <w:pPr>
-        <w:spacing w:line="240" w:lineRule="auto"/>
-      </w:pPr>
-      <w:r>
-        <w:rPr>
-          <w:i/>
-          <w:sz w:val="24"/>
-        </w:rPr>
+        <w:pStyle w:val="Listing"/>
+      </w:pPr>
+      <w:r>
         <w:t xml:space="preserve">    public void Subscribe()</w:t>
       </w:r>
     </w:p>
     <w:p>
       <w:pPr>
-        <w:spacing w:line="240" w:lineRule="auto"/>
-      </w:pPr>
-      <w:r>
-        <w:rPr>
-          <w:i/>
-          <w:sz w:val="24"/>
-        </w:rPr>
+        <w:pStyle w:val="Listing"/>
+      </w:pPr>
+      <w:r>
         <w:t xml:space="preserve">    {</w:t>
       </w:r>
     </w:p>
     <w:p>
       <w:pPr>
-        <w:spacing w:line="240" w:lineRule="auto"/>
-      </w:pPr>
-      <w:r>
-        <w:rPr>
-          <w:i/>
-          <w:sz w:val="24"/>
-        </w:rPr>
+        <w:pStyle w:val="Listing"/>
+      </w:pPr>
+      <w:r>
         <w:t xml:space="preserve">        var bigObject = new byte[1024 * 100];</w:t>
       </w:r>
     </w:p>
     <w:p>
       <w:pPr>
-        <w:spacing w:line="240" w:lineRule="auto"/>
-      </w:pPr>
-      <w:r>
-        <w:rPr>
-          <w:i/>
-          <w:sz w:val="24"/>
-        </w:rPr>
+        <w:pStyle w:val="Listing"/>
+      </w:pPr>
+      <w:r>
         <w:t xml:space="preserve">        EventHandler handler = (sender, e) =&gt; { bigObject[0]++; };</w:t>
       </w:r>
     </w:p>
     <w:p>
       <w:pPr>
-        <w:spacing w:line="240" w:lineRule="auto"/>
-      </w:pPr>
-      <w:r>
-        <w:rPr>
-          <w:i/>
-          <w:sz w:val="24"/>
-        </w:rPr>
+        <w:pStyle w:val="Listing"/>
+      </w:pPr>
+      <w:r>
         <w:t xml:space="preserve">        DemoEvent += handler;</w:t>
       </w:r>
     </w:p>
     <w:p>
       <w:pPr>
-        <w:spacing w:line="240" w:lineRule="auto"/>
-      </w:pPr>
-      <w:r>
-        <w:rPr>
-          <w:i/>
-          <w:sz w:val="24"/>
-        </w:rPr>
+        <w:pStyle w:val="Listing"/>
+      </w:pPr>
+      <w:r>
         <w:t xml:space="preserve">        _handlers.Add(handler);</w:t>
       </w:r>
     </w:p>
     <w:p>
       <w:pPr>
-        <w:spacing w:line="240" w:lineRule="auto"/>
-      </w:pPr>
-      <w:r>
-        <w:rPr>
-          <w:i/>
-          <w:sz w:val="24"/>
-        </w:rPr>
+        <w:pStyle w:val="Listing"/>
+      </w:pPr>
+      <w:r>
         <w:t xml:space="preserve">    }</w:t>
       </w:r>
     </w:p>
     <w:p>
       <w:pPr>
-        <w:spacing w:line="240" w:lineRule="auto"/>
-      </w:pPr>
-    </w:p>
-    <w:p>
-      <w:pPr>
-        <w:spacing w:line="240" w:lineRule="auto"/>
-      </w:pPr>
-      <w:r>
-        <w:rPr>
-          <w:i/>
-          <w:sz w:val="24"/>
-        </w:rPr>
+        <w:pStyle w:val="Listing"/>
+      </w:pPr>
+    </w:p>
+    <w:p>
+      <w:pPr>
+        <w:pStyle w:val="Listing"/>
+      </w:pPr>
+      <w:r>
         <w:t xml:space="preserve">    // Отписка от всех подписок</w:t>
       </w:r>
     </w:p>
     <w:p>
       <w:pPr>
-        <w:spacing w:line="240" w:lineRule="auto"/>
-      </w:pPr>
-      <w:r>
-        <w:rPr>
-          <w:i/>
-          <w:sz w:val="24"/>
-        </w:rPr>
+        <w:pStyle w:val="Listing"/>
+      </w:pPr>
+      <w:r>
         <w:t xml:space="preserve">    public void Unsubscribe()</w:t>
       </w:r>
     </w:p>
     <w:p>
       <w:pPr>
-        <w:spacing w:line="240" w:lineRule="auto"/>
-      </w:pPr>
-      <w:r>
-        <w:rPr>
-          <w:i/>
-          <w:sz w:val="24"/>
-        </w:rPr>
+        <w:pStyle w:val="Listing"/>
+      </w:pPr>
+      <w:r>
         <w:t xml:space="preserve">    {</w:t>
       </w:r>
     </w:p>
     <w:p>
       <w:pPr>
-        <w:spacing w:line="240" w:lineRule="auto"/>
-      </w:pPr>
-      <w:r>
-        <w:rPr>
-          <w:i/>
-          <w:sz w:val="24"/>
-        </w:rPr>
+        <w:pStyle w:val="Listing"/>
+      </w:pPr>
+      <w:r>
         <w:t xml:space="preserve">        foreach (var handler in _handlers)</w:t>
       </w:r>
     </w:p>
     <w:p>
       <w:pPr>
-        <w:spacing w:line="240" w:lineRule="auto"/>
-      </w:pPr>
-      <w:r>
-        <w:rPr>
-          <w:i/>
-          <w:sz w:val="24"/>
-        </w:rPr>
-        <w:t xml:space="preserve">            DemoEvent</w:t>
-      </w:r>
-      <w:r>
-        <w:rPr>
-          <w:i/>
-          <w:sz w:val="24"/>
-        </w:rPr>
-        <w:t xml:space="preserve"> -= handler;</w:t>
-      </w:r>
-    </w:p>
-    <w:p>
-      <w:pPr>
-        <w:spacing w:line="240" w:lineRule="auto"/>
-      </w:pPr>
-      <w:r>
-        <w:rPr>
-          <w:i/>
-          <w:sz w:val="24"/>
-        </w:rPr>
+        <w:pStyle w:val="Listing"/>
+      </w:pPr>
+      <w:r>
+        <w:t xml:space="preserve">            DemoEvent -= handler;</w:t>
+      </w:r>
+    </w:p>
+    <w:p>
+      <w:pPr>
+        <w:pStyle w:val="Listing"/>
+      </w:pPr>
+      <w:r>
         <w:t xml:space="preserve">        _handlers.Clear();</w:t>
       </w:r>
     </w:p>
     <w:p>
       <w:pPr>
-        <w:spacing w:line="240" w:lineRule="auto"/>
-      </w:pPr>
-      <w:r>
-        <w:rPr>
-          <w:i/>
-          <w:sz w:val="24"/>
-        </w:rPr>
+        <w:pStyle w:val="Listing"/>
+      </w:pPr>
+      <w:r>
         <w:t xml:space="preserve">    }</w:t>
       </w:r>
     </w:p>
     <w:p>
       <w:pPr>
-        <w:spacing w:line="240" w:lineRule="auto"/>
-      </w:pPr>
-      <w:r>
-        <w:rPr>
-          <w:i/>
-          <w:sz w:val="24"/>
-        </w:rPr>
+        <w:pStyle w:val="Listing"/>
+      </w:pPr>
+      <w:r>
         <w:t>}</w:t>
       </w:r>
     </w:p>
@@ -4832,7 +4344,7 @@
         </w:rPr>
         <w:lastRenderedPageBreak/>
         <w:drawing>
-          <wp:inline distT="0" distB="0" distL="0" distR="0" wp14:anchorId="12FF27E0" wp14:editId="61A970C0">
+          <wp:inline distT="0" distB="0" distL="0" distR="0" wp14:anchorId="2B367B6F" wp14:editId="642A2AB6">
             <wp:extent cx="5580000" cy="3987262"/>
             <wp:effectExtent l="0" t="0" r="0" b="0"/>
             <wp:docPr id="8" name="Picture 8"/>
@@ -4908,7 +4420,7 @@
         <w:t>()</w:t>
       </w:r>
       <w:r>
-        <w:t xml:space="preserve"> осталась на уровне 10 322 КБ, так как статический список удерживает все объекты. После 100 подписок память выросла с 10 330 КБ до 20 343 КБ и не уменьшилась после сборки, но после отписки вернулась к 10 339 КБ. Новый объект последовательно перешел из </w:t>
+        <w:t xml:space="preserve"> осталась на уровне 10 322 КБ, так как статический список удерживает все объекты. После 100 подписок память выросла с 10 330 КБ до 20 357 КБ и не уменьшилась после сборки, но после отписки вернулась к 10 339 КБ. Новый объект последовательно перешел из </w:t>
       </w:r>
       <w:r>
         <w:rPr>
@@ -4953,7 +4465,7 @@
         <w:spacing w:before="360"/>
         <w:ind w:firstLine="709"/>
       </w:pPr>
-      <w:bookmarkStart w:id="9" w:name="_Toc242378570"/>
+      <w:bookmarkStart w:id="9" w:name="_Toc242385951"/>
       <w:r>
         <w:rPr>
           <w:rFonts w:ascii="Times New Roman" w:hAnsi="Times New Roman"/>
@@ -4990,7 +4502,7 @@
         </w:rPr>
         <w:lastRenderedPageBreak/>
         <w:drawing>
-          <wp:inline distT="0" distB="0" distL="0" distR="0" wp14:anchorId="3C574E51" wp14:editId="7C6447B9">
+          <wp:inline distT="0" distB="0" distL="0" distR="0" wp14:anchorId="40B57CB5" wp14:editId="0D7DF783">
             <wp:extent cx="5580000" cy="2297010"/>
             <wp:effectExtent l="0" t="0" r="0" b="0"/>
             <wp:docPr id="9" name="Picture 9"/>
@@ -5042,7 +4554,7 @@
         <w:jc w:val="both"/>
       </w:pPr>
       <w:r>
-        <w:t xml:space="preserve">Память после выделения выросла с 10 494 КБ до 20 490 КБ и не изменилась при сборке, пока ссылки удерживались. После очистки списка и </w:t>
+        <w:t xml:space="preserve">Память после выделения выросла с 10 490 КБ до 20 356 КБ и не изменилась при сборке, пока ссылки удерживались. После очистки списка и </w:t>
       </w:r>
       <w:r>
         <w:rPr>
@@ -5090,7 +4602,7 @@
         <w:spacing w:before="360"/>
         <w:ind w:firstLine="709"/>
       </w:pPr>
-      <w:bookmarkStart w:id="10" w:name="_Toc242378571"/>
+      <w:bookmarkStart w:id="10" w:name="_Toc242385952"/>
       <w:r>
         <w:rPr>
           <w:rFonts w:ascii="Times New Roman" w:hAnsi="Times New Roman"/>
@@ -5270,442 +4782,299 @@
     </w:p>
     <w:p>
       <w:pPr>
-        <w:spacing w:line="240" w:lineRule="auto"/>
-      </w:pPr>
-      <w:r>
-        <w:rPr>
-          <w:i/>
-          <w:sz w:val="24"/>
-        </w:rPr>
+        <w:pStyle w:val="Listing"/>
+      </w:pPr>
+      <w:r>
         <w:t>public class UnoptimizedCode</w:t>
       </w:r>
     </w:p>
     <w:p>
       <w:pPr>
-        <w:spacing w:line="240" w:lineRule="auto"/>
-      </w:pPr>
-      <w:r>
-        <w:rPr>
-          <w:i/>
-          <w:sz w:val="24"/>
-        </w:rPr>
+        <w:pStyle w:val="Listing"/>
+      </w:pPr>
+      <w:r>
         <w:t>{</w:t>
       </w:r>
     </w:p>
     <w:p>
       <w:pPr>
-        <w:spacing w:line="240" w:lineRule="auto"/>
-      </w:pPr>
-      <w:r>
-        <w:rPr>
-          <w:i/>
-          <w:sz w:val="24"/>
-        </w:rPr>
+        <w:pStyle w:val="Listing"/>
+      </w:pPr>
+      <w:r>
         <w:t xml:space="preserve">    private ArrayList _data = new ArrayList();</w:t>
       </w:r>
     </w:p>
     <w:p>
       <w:pPr>
-        <w:spacing w:line="240" w:lineRule="auto"/>
-      </w:pPr>
-    </w:p>
-    <w:p>
-      <w:pPr>
-        <w:spacing w:line="240" w:lineRule="auto"/>
-      </w:pPr>
-      <w:r>
-        <w:rPr>
-          <w:i/>
-          <w:sz w:val="24"/>
-        </w:rPr>
+        <w:pStyle w:val="Listing"/>
+      </w:pPr>
+    </w:p>
+    <w:p>
+      <w:pPr>
+        <w:pStyle w:val="Listing"/>
+      </w:pPr>
+      <w:r>
         <w:t xml:space="preserve">    public void AddData(int value)</w:t>
       </w:r>
     </w:p>
     <w:p>
       <w:pPr>
-        <w:spacing w:line="240" w:lineRule="auto"/>
-      </w:pPr>
-      <w:r>
-        <w:rPr>
-          <w:i/>
-          <w:sz w:val="24"/>
-        </w:rPr>
+        <w:pStyle w:val="Listing"/>
+      </w:pPr>
+      <w:r>
         <w:t xml:space="preserve">    {</w:t>
       </w:r>
     </w:p>
     <w:p>
       <w:pPr>
-        <w:spacing w:line="240" w:lineRule="auto"/>
-      </w:pPr>
-      <w:r>
-        <w:rPr>
-          <w:i/>
-          <w:sz w:val="24"/>
-        </w:rPr>
+        <w:pStyle w:val="Listing"/>
+      </w:pPr>
+      <w:r>
         <w:t xml:space="preserve">        _data.Add(value); // Упаковка!</w:t>
       </w:r>
     </w:p>
     <w:p>
       <w:pPr>
-        <w:spacing w:line="240" w:lineRule="auto"/>
-      </w:pPr>
-      <w:r>
-        <w:rPr>
-          <w:i/>
-          <w:sz w:val="24"/>
-        </w:rPr>
+        <w:pStyle w:val="Listing"/>
+      </w:pPr>
+      <w:r>
         <w:t xml:space="preserve">    }</w:t>
       </w:r>
     </w:p>
     <w:p>
       <w:pPr>
-        <w:spacing w:line="240" w:lineRule="auto"/>
-      </w:pPr>
-    </w:p>
-    <w:p>
-      <w:pPr>
-        <w:spacing w:line="240" w:lineRule="auto"/>
-      </w:pPr>
-      <w:r>
-        <w:rPr>
-          <w:i/>
-          <w:sz w:val="24"/>
-        </w:rPr>
+        <w:pStyle w:val="Listing"/>
+      </w:pPr>
+    </w:p>
+    <w:p>
+      <w:pPr>
+        <w:pStyle w:val="Listing"/>
+      </w:pPr>
+      <w:r>
         <w:t xml:space="preserve">    public int GetSum()</w:t>
       </w:r>
     </w:p>
     <w:p>
       <w:pPr>
-        <w:spacing w:line="240" w:lineRule="auto"/>
-      </w:pPr>
-      <w:r>
-        <w:rPr>
-          <w:i/>
-          <w:sz w:val="24"/>
-        </w:rPr>
+        <w:pStyle w:val="Listing"/>
+      </w:pPr>
+      <w:r>
         <w:t xml:space="preserve">    {</w:t>
       </w:r>
     </w:p>
     <w:p>
       <w:pPr>
-        <w:spacing w:line="240" w:lineRule="auto"/>
-      </w:pPr>
-      <w:r>
-        <w:rPr>
-          <w:i/>
-          <w:sz w:val="24"/>
-        </w:rPr>
+        <w:pStyle w:val="Listing"/>
+      </w:pPr>
+      <w:r>
         <w:t xml:space="preserve">        int sum = 0;</w:t>
       </w:r>
     </w:p>
     <w:p>
       <w:pPr>
-        <w:spacing w:line="240" w:lineRule="auto"/>
-      </w:pPr>
-      <w:r>
-        <w:rPr>
-          <w:i/>
-          <w:sz w:val="24"/>
-        </w:rPr>
+        <w:pStyle w:val="Listing"/>
+      </w:pPr>
+      <w:r>
         <w:t xml:space="preserve">        foreach (object item in _data) // Распаковка!</w:t>
       </w:r>
     </w:p>
     <w:p>
       <w:pPr>
-        <w:spacing w:line="240" w:lineRule="auto"/>
-      </w:pPr>
-      <w:r>
-        <w:rPr>
-          <w:i/>
-          <w:sz w:val="24"/>
-        </w:rPr>
+        <w:pStyle w:val="Listing"/>
+      </w:pPr>
+      <w:r>
         <w:t xml:space="preserve">        {</w:t>
       </w:r>
     </w:p>
     <w:p>
       <w:pPr>
-        <w:spacing w:line="240" w:lineRule="auto"/>
-      </w:pPr>
-      <w:r>
-        <w:rPr>
-          <w:i/>
-          <w:sz w:val="24"/>
-        </w:rPr>
+        <w:pStyle w:val="Listing"/>
+      </w:pPr>
+      <w:r>
         <w:t xml:space="preserve">            sum += (int)item;</w:t>
       </w:r>
     </w:p>
     <w:p>
       <w:pPr>
-        <w:spacing w:line="240" w:lineRule="auto"/>
-      </w:pPr>
-      <w:r>
-        <w:rPr>
-          <w:i/>
-          <w:sz w:val="24"/>
-        </w:rPr>
+        <w:pStyle w:val="Listing"/>
+      </w:pPr>
+      <w:r>
         <w:t xml:space="preserve">        }</w:t>
       </w:r>
     </w:p>
     <w:p>
       <w:pPr>
-        <w:spacing w:line="240" w:lineRule="auto"/>
-      </w:pPr>
-      <w:r>
-        <w:rPr>
-          <w:i/>
-          <w:sz w:val="24"/>
-        </w:rPr>
+        <w:pStyle w:val="Listing"/>
+      </w:pPr>
+      <w:r>
         <w:t xml:space="preserve">        return sum;</w:t>
       </w:r>
     </w:p>
     <w:p>
       <w:pPr>
-        <w:spacing w:line="240" w:lineRule="auto"/>
-      </w:pPr>
-      <w:r>
-        <w:rPr>
-          <w:i/>
-          <w:sz w:val="24"/>
-        </w:rPr>
+        <w:pStyle w:val="Listing"/>
+      </w:pPr>
+      <w:r>
         <w:lastRenderedPageBreak/>
         <w:t xml:space="preserve">    }</w:t>
       </w:r>
     </w:p>
     <w:p>
       <w:pPr>
-        <w:spacing w:line="240" w:lineRule="auto"/>
-      </w:pPr>
-      <w:r>
-        <w:rPr>
-          <w:i/>
-          <w:sz w:val="24"/>
-        </w:rPr>
+        <w:pStyle w:val="Listing"/>
+      </w:pPr>
+      <w:r>
         <w:t>}</w:t>
       </w:r>
     </w:p>
     <w:p>
       <w:pPr>
-        <w:spacing w:line="240" w:lineRule="auto"/>
-      </w:pPr>
-    </w:p>
-    <w:p>
-      <w:pPr>
-        <w:spacing w:line="240" w:lineRule="auto"/>
-      </w:pPr>
-      <w:r>
-        <w:rPr>
-          <w:i/>
-          <w:sz w:val="24"/>
-        </w:rPr>
+        <w:pStyle w:val="Listing"/>
+      </w:pPr>
+    </w:p>
+    <w:p>
+      <w:pPr>
+        <w:pStyle w:val="Listing"/>
+      </w:pPr>
+      <w:r>
         <w:t>public class OptimizedCode</w:t>
       </w:r>
     </w:p>
     <w:p>
       <w:pPr>
-        <w:spacing w:line="240" w:lineRule="auto"/>
-      </w:pPr>
-      <w:r>
-        <w:rPr>
-          <w:i/>
-          <w:sz w:val="24"/>
-        </w:rPr>
+        <w:pStyle w:val="Listing"/>
+      </w:pPr>
+      <w:r>
         <w:t>{</w:t>
       </w:r>
     </w:p>
     <w:p>
       <w:pPr>
-        <w:spacing w:line="240" w:lineRule="auto"/>
-      </w:pPr>
-      <w:r>
-        <w:rPr>
-          <w:i/>
-          <w:sz w:val="24"/>
-        </w:rPr>
+        <w:pStyle w:val="Listing"/>
+      </w:pPr>
+      <w:r>
         <w:t xml:space="preserve">    private List&lt;int&gt; _data = new List&lt;int&gt;();</w:t>
       </w:r>
     </w:p>
     <w:p>
       <w:pPr>
-        <w:spacing w:line="240" w:lineRule="auto"/>
-      </w:pPr>
-    </w:p>
-    <w:p>
-      <w:pPr>
-        <w:spacing w:line="240" w:lineRule="auto"/>
-      </w:pPr>
-      <w:r>
-        <w:rPr>
-          <w:i/>
-          <w:sz w:val="24"/>
-        </w:rPr>
-        <w:t xml:space="preserve">    public void AddData(</w:t>
-      </w:r>
-      <w:r>
-        <w:rPr>
-          <w:i/>
-          <w:sz w:val="24"/>
-        </w:rPr>
-        <w:t>int value)</w:t>
-      </w:r>
-    </w:p>
-    <w:p>
-      <w:pPr>
-        <w:spacing w:line="240" w:lineRule="auto"/>
-      </w:pPr>
-      <w:r>
-        <w:rPr>
-          <w:i/>
-          <w:sz w:val="24"/>
-        </w:rPr>
+        <w:pStyle w:val="Listing"/>
+      </w:pPr>
+    </w:p>
+    <w:p>
+      <w:pPr>
+        <w:pStyle w:val="Listing"/>
+      </w:pPr>
+      <w:r>
+        <w:t xml:space="preserve">    public void AddData(int value)</w:t>
+      </w:r>
+    </w:p>
+    <w:p>
+      <w:pPr>
+        <w:pStyle w:val="Listing"/>
+      </w:pPr>
+      <w:r>
         <w:t xml:space="preserve">    {</w:t>
       </w:r>
     </w:p>
     <w:p>
       <w:pPr>
-        <w:spacing w:line="240" w:lineRule="auto"/>
-      </w:pPr>
-      <w:r>
-        <w:rPr>
-          <w:i/>
-          <w:sz w:val="24"/>
-        </w:rPr>
+        <w:pStyle w:val="Listing"/>
+      </w:pPr>
+      <w:r>
         <w:t xml:space="preserve">        _data.Add(value); // Без упаковки</w:t>
       </w:r>
     </w:p>
     <w:p>
       <w:pPr>
-        <w:spacing w:line="240" w:lineRule="auto"/>
-      </w:pPr>
-      <w:r>
-        <w:rPr>
-          <w:i/>
-          <w:sz w:val="24"/>
-        </w:rPr>
+        <w:pStyle w:val="Listing"/>
+      </w:pPr>
+      <w:r>
         <w:t xml:space="preserve">    }</w:t>
       </w:r>
     </w:p>
     <w:p>
       <w:pPr>
-        <w:spacing w:line="240" w:lineRule="auto"/>
-      </w:pPr>
-    </w:p>
-    <w:p>
-      <w:pPr>
-        <w:spacing w:line="240" w:lineRule="auto"/>
-      </w:pPr>
-      <w:r>
-        <w:rPr>
-          <w:i/>
-          <w:sz w:val="24"/>
-        </w:rPr>
+        <w:pStyle w:val="Listing"/>
+      </w:pPr>
+    </w:p>
+    <w:p>
+      <w:pPr>
+        <w:pStyle w:val="Listing"/>
+      </w:pPr>
+      <w:r>
         <w:t xml:space="preserve">    public int GetSum()</w:t>
       </w:r>
     </w:p>
     <w:p>
       <w:pPr>
-        <w:spacing w:line="240" w:lineRule="auto"/>
-      </w:pPr>
-      <w:r>
-        <w:rPr>
-          <w:i/>
-          <w:sz w:val="24"/>
-        </w:rPr>
+        <w:pStyle w:val="Listing"/>
+      </w:pPr>
+      <w:r>
         <w:t xml:space="preserve">    {</w:t>
       </w:r>
     </w:p>
     <w:p>
       <w:pPr>
-        <w:spacing w:line="240" w:lineRule="auto"/>
-      </w:pPr>
-      <w:r>
-        <w:rPr>
-          <w:i/>
-          <w:sz w:val="24"/>
-        </w:rPr>
+        <w:pStyle w:val="Listing"/>
+      </w:pPr>
+      <w:r>
         <w:t xml:space="preserve">        int sum = 0;</w:t>
       </w:r>
     </w:p>
     <w:p>
       <w:pPr>
-        <w:spacing w:line="240" w:lineRule="auto"/>
-      </w:pPr>
-      <w:r>
-        <w:rPr>
-          <w:i/>
-          <w:sz w:val="24"/>
-        </w:rPr>
+        <w:pStyle w:val="Listing"/>
+      </w:pPr>
+      <w:r>
         <w:t xml:space="preserve">        foreach (int item in _data)</w:t>
       </w:r>
     </w:p>
     <w:p>
       <w:pPr>
-        <w:spacing w:line="240" w:lineRule="auto"/>
-      </w:pPr>
-      <w:r>
-        <w:rPr>
-          <w:i/>
-          <w:sz w:val="24"/>
-        </w:rPr>
+        <w:pStyle w:val="Listing"/>
+      </w:pPr>
+      <w:r>
         <w:t xml:space="preserve">        {</w:t>
       </w:r>
     </w:p>
     <w:p>
       <w:pPr>
-        <w:spacing w:line="240" w:lineRule="auto"/>
-      </w:pPr>
-      <w:r>
-        <w:rPr>
-          <w:i/>
-          <w:sz w:val="24"/>
-        </w:rPr>
+        <w:pStyle w:val="Listing"/>
+      </w:pPr>
+      <w:r>
         <w:t xml:space="preserve">            sum += item;</w:t>
       </w:r>
     </w:p>
     <w:p>
       <w:pPr>
-        <w:spacing w:line="240" w:lineRule="auto"/>
-      </w:pPr>
-      <w:r>
-        <w:rPr>
-          <w:i/>
-          <w:sz w:val="24"/>
-        </w:rPr>
+        <w:pStyle w:val="Listing"/>
+      </w:pPr>
+      <w:r>
         <w:t xml:space="preserve">        }</w:t>
       </w:r>
     </w:p>
     <w:p>
       <w:pPr>
-        <w:spacing w:line="240" w:lineRule="auto"/>
-      </w:pPr>
-      <w:r>
-        <w:rPr>
-          <w:i/>
-          <w:sz w:val="24"/>
-        </w:rPr>
+        <w:pStyle w:val="Listing"/>
+      </w:pPr>
+      <w:r>
         <w:t xml:space="preserve">        return sum;</w:t>
       </w:r>
     </w:p>
     <w:p>
       <w:pPr>
-        <w:spacing w:line="240" w:lineRule="auto"/>
-      </w:pPr>
-      <w:r>
-        <w:rPr>
-          <w:i/>
-          <w:sz w:val="24"/>
-        </w:rPr>
+        <w:pStyle w:val="Listing"/>
+      </w:pPr>
+      <w:r>
         <w:t xml:space="preserve">    }</w:t>
       </w:r>
     </w:p>
     <w:p>
       <w:pPr>
-        <w:spacing w:line="240" w:lineRule="auto"/>
-      </w:pPr>
-      <w:r>
-        <w:rPr>
-          <w:i/>
-          <w:sz w:val="24"/>
-        </w:rPr>
+        <w:pStyle w:val="Listing"/>
+      </w:pPr>
+      <w:r>
         <w:t>}</w:t>
       </w:r>
     </w:p>
@@ -5730,7 +5099,7 @@
           <w:noProof/>
         </w:rPr>
         <w:drawing>
-          <wp:inline distT="0" distB="0" distL="0" distR="0" wp14:anchorId="2E207D4B" wp14:editId="2F736E1B">
+          <wp:inline distT="0" distB="0" distL="0" distR="0" wp14:anchorId="348D0234" wp14:editId="209A65C6">
             <wp:extent cx="5580000" cy="1516893"/>
             <wp:effectExtent l="0" t="0" r="0" b="0"/>
             <wp:docPr id="10" name="Picture 10"/>
@@ -5782,7 +5151,7 @@
         <w:jc w:val="both"/>
       </w:pPr>
       <w:r>
-        <w:t xml:space="preserve">Вариант с упаковкой выполнился за 170 мс и занял 31 619 КБ, вариант без упаковки – за 9 мс и 8 192 КБ. Для кода с </w:t>
+        <w:t xml:space="preserve">Вариант с упаковкой выполнился за 84 мс и занял 31 618 КБ, вариант без упаковки – за 4 мс и 6 296 КБ. Для кода с </w:t>
       </w:r>
       <w:r>
         <w:rPr>
@@ -5791,7 +5160,7 @@
         <w:t>ArrayList</w:t>
       </w:r>
       <w:r>
-        <w:t xml:space="preserve"> получено 213 мс и 37 776 КБ, для оптимизированного кода – 11 мс и 6 292 КБ.</w:t>
+        <w:t xml:space="preserve"> получено 218 мс и 31 635 КБ, для оптимизированного кода – 14 мс и 6 292 КБ.</w:t>
       </w:r>
     </w:p>
     <w:p>
@@ -5961,7 +5330,7 @@
               <w:rPr>
                 <w:sz w:val="24"/>
               </w:rPr>
-              <w:t>170</w:t>
+              <w:t>84</w:t>
             </w:r>
           </w:p>
         </w:tc>
@@ -5978,7 +5347,7 @@
               <w:rPr>
                 <w:sz w:val="24"/>
               </w:rPr>
-              <w:t>31 619</w:t>
+              <w:t>31 618</w:t>
             </w:r>
           </w:p>
         </w:tc>
@@ -6049,7 +5418,7 @@
               <w:rPr>
                 <w:sz w:val="24"/>
               </w:rPr>
-              <w:t>9</w:t>
+              <w:t>4</w:t>
             </w:r>
           </w:p>
         </w:tc>
@@ -6065,7 +5434,7 @@
               <w:rPr>
                 <w:sz w:val="24"/>
               </w:rPr>
-              <w:t>8 192</w:t>
+              <w:t>6 296</w:t>
             </w:r>
           </w:p>
         </w:tc>
@@ -6123,7 +5492,7 @@
               <w:rPr>
                 <w:sz w:val="24"/>
               </w:rPr>
-              <w:t>213</w:t>
+              <w:t>218</w:t>
             </w:r>
           </w:p>
         </w:tc>
@@ -6139,7 +5508,7 @@
               <w:rPr>
                 <w:sz w:val="24"/>
               </w:rPr>
-              <w:t>37 776</w:t>
+              <w:t>31 635</w:t>
             </w:r>
           </w:p>
         </w:tc>
@@ -6211,7 +5580,7 @@
               <w:rPr>
                 <w:sz w:val="24"/>
               </w:rPr>
-              <w:t>11</w:t>
+              <w:t>14</w:t>
             </w:r>
           </w:p>
         </w:tc>
@@ -6261,7 +5630,7 @@
         <w:t>&gt;</w:t>
       </w:r>
       <w:r>
-        <w:t xml:space="preserve"> хранит числа в одном непрерывном массиве без дополнительных объектов, поэтому в данном замере он быстрее примерно в 19 раз.</w:t>
+        <w:t xml:space="preserve"> хранит числа в одном непрерывном массиве без дополнительных объектов, поэтому в данном замере он быстрее примерно в 15–20 раз.</w:t>
       </w:r>
     </w:p>
     <w:p>
@@ -6270,7 +5639,7 @@
         <w:spacing w:before="360"/>
         <w:ind w:firstLine="709"/>
       </w:pPr>
-      <w:bookmarkStart w:id="11" w:name="_Toc242378572"/>
+      <w:bookmarkStart w:id="11" w:name="_Toc242385953"/>
       <w:r>
         <w:rPr>
           <w:rFonts w:ascii="Times New Roman" w:hAnsi="Times New Roman"/>
@@ -6720,746 +6089,500 @@
     </w:p>
     <w:p>
       <w:pPr>
-        <w:spacing w:line="240" w:lineRule="auto"/>
-      </w:pPr>
-      <w:r>
-        <w:rPr>
-          <w:i/>
-          <w:sz w:val="24"/>
-        </w:rPr>
+        <w:pStyle w:val="Listing"/>
+      </w:pPr>
+      <w:r>
         <w:t>public class BuggyCode</w:t>
       </w:r>
     </w:p>
     <w:p>
       <w:pPr>
-        <w:spacing w:line="240" w:lineRule="auto"/>
-      </w:pPr>
-      <w:r>
-        <w:rPr>
-          <w:i/>
-          <w:sz w:val="24"/>
-        </w:rPr>
+        <w:pStyle w:val="Listing"/>
+      </w:pPr>
+      <w:r>
         <w:t>{</w:t>
       </w:r>
     </w:p>
     <w:p>
       <w:pPr>
-        <w:spacing w:line="240" w:lineRule="auto"/>
-      </w:pPr>
-      <w:r>
-        <w:rPr>
-          <w:i/>
-          <w:sz w:val="24"/>
-        </w:rPr>
+        <w:pStyle w:val="Listing"/>
+      </w:pPr>
+      <w:r>
         <w:t xml:space="preserve">    private static List&lt;IDisposable&gt; _cache = new List&lt;IDisposable&gt;();</w:t>
       </w:r>
     </w:p>
     <w:p>
       <w:pPr>
-        <w:spacing w:line="240" w:lineRule="auto"/>
-      </w:pPr>
-      <w:r>
-        <w:rPr>
-          <w:i/>
-          <w:sz w:val="24"/>
-        </w:rPr>
+        <w:pStyle w:val="Listing"/>
+      </w:pPr>
+      <w:r>
         <w:t xml:space="preserve">    private static event EventHandler? _globalEvent;</w:t>
       </w:r>
     </w:p>
     <w:p>
       <w:pPr>
-        <w:spacing w:line="240" w:lineRule="auto"/>
-      </w:pPr>
-      <w:r>
-        <w:rPr>
-          <w:i/>
-          <w:sz w:val="24"/>
-        </w:rPr>
+        <w:pStyle w:val="Listing"/>
+      </w:pPr>
+      <w:r>
         <w:t xml:space="preserve">    private byte[] _data = new byte[1024 * 1024];</w:t>
       </w:r>
     </w:p>
     <w:p>
       <w:pPr>
-        <w:spacing w:line="240" w:lineRule="auto"/>
-      </w:pPr>
-    </w:p>
-    <w:p>
-      <w:pPr>
-        <w:spacing w:line="240" w:lineRule="auto"/>
-      </w:pPr>
-      <w:r>
-        <w:rPr>
-          <w:i/>
-          <w:sz w:val="24"/>
-        </w:rPr>
+        <w:pStyle w:val="Listing"/>
+      </w:pPr>
+    </w:p>
+    <w:p>
+      <w:pPr>
+        <w:pStyle w:val="Listing"/>
+      </w:pPr>
+      <w:r>
         <w:t xml:space="preserve">    public BuggyCode()</w:t>
       </w:r>
     </w:p>
     <w:p>
       <w:pPr>
-        <w:spacing w:line="240" w:lineRule="auto"/>
-      </w:pPr>
-      <w:r>
-        <w:rPr>
-          <w:i/>
-          <w:sz w:val="24"/>
-        </w:rPr>
+        <w:pStyle w:val="Listing"/>
+      </w:pPr>
+      <w:r>
         <w:t xml:space="preserve">    {</w:t>
       </w:r>
     </w:p>
     <w:p>
       <w:pPr>
-        <w:spacing w:line="240" w:lineRule="auto"/>
-      </w:pPr>
-      <w:r>
-        <w:rPr>
-          <w:i/>
-          <w:sz w:val="24"/>
-        </w:rPr>
+        <w:pStyle w:val="Listing"/>
+      </w:pPr>
+      <w:r>
         <w:t xml:space="preserve">        _globalEvent += OnEvent;              // Утечка 1: подписка на статическое событие без отписки</w:t>
       </w:r>
     </w:p>
     <w:p>
       <w:pPr>
-        <w:spacing w:line="240" w:lineRule="auto"/>
-      </w:pPr>
-      <w:r>
-        <w:rPr>
-          <w:i/>
-          <w:sz w:val="24"/>
-        </w:rPr>
-        <w:t xml:space="preserve">        _</w:t>
-      </w:r>
-      <w:r>
-        <w:rPr>
-          <w:i/>
-          <w:sz w:val="24"/>
-        </w:rPr>
-        <w:t>cache.Add(new MemoryStream(1024));   // Утечка 2: статический кэш хранит потоки и не освобождает их</w:t>
-      </w:r>
-    </w:p>
-    <w:p>
-      <w:pPr>
-        <w:spacing w:line="240" w:lineRule="auto"/>
-      </w:pPr>
-      <w:r>
-        <w:rPr>
-          <w:i/>
-          <w:sz w:val="24"/>
-        </w:rPr>
+        <w:pStyle w:val="Listing"/>
+      </w:pPr>
+      <w:r>
+        <w:t xml:space="preserve">        _cache.Add(new MemoryStream(1024));   // Утечка 2: статический кэш хранит потоки и не освобождает их</w:t>
+      </w:r>
+    </w:p>
+    <w:p>
+      <w:pPr>
+        <w:pStyle w:val="Listing"/>
+      </w:pPr>
+      <w:r>
         <w:t xml:space="preserve">    }</w:t>
       </w:r>
     </w:p>
     <w:p>
       <w:pPr>
-        <w:spacing w:line="240" w:lineRule="auto"/>
-      </w:pPr>
-    </w:p>
-    <w:p>
-      <w:pPr>
-        <w:spacing w:line="240" w:lineRule="auto"/>
-      </w:pPr>
-      <w:r>
-        <w:rPr>
-          <w:i/>
-          <w:sz w:val="24"/>
-        </w:rPr>
+        <w:pStyle w:val="Listing"/>
+      </w:pPr>
+    </w:p>
+    <w:p>
+      <w:pPr>
+        <w:pStyle w:val="Listing"/>
+      </w:pPr>
+      <w:r>
         <w:t xml:space="preserve">    private void OnEvent(object? sender, EventArgs e)</w:t>
       </w:r>
     </w:p>
     <w:p>
       <w:pPr>
-        <w:spacing w:line="240" w:lineRule="auto"/>
-      </w:pPr>
-      <w:r>
-        <w:rPr>
-          <w:i/>
-          <w:sz w:val="24"/>
-        </w:rPr>
+        <w:pStyle w:val="Listing"/>
+      </w:pPr>
+      <w:r>
         <w:t xml:space="preserve">    {</w:t>
       </w:r>
     </w:p>
     <w:p>
       <w:pPr>
-        <w:spacing w:line="240" w:lineRule="auto"/>
-      </w:pPr>
-      <w:r>
-        <w:rPr>
-          <w:i/>
-          <w:sz w:val="24"/>
-        </w:rPr>
+        <w:pStyle w:val="Listing"/>
+      </w:pPr>
+      <w:r>
+        <w:t xml:space="preserve">        var temp = new byte[1024 * 100];</w:t>
+      </w:r>
+    </w:p>
+    <w:p>
+      <w:pPr>
+        <w:pStyle w:val="Listing"/>
+      </w:pPr>
+      <w:r>
         <w:lastRenderedPageBreak/>
+        <w:t xml:space="preserve">    }</w:t>
+      </w:r>
+    </w:p>
+    <w:p>
+      <w:pPr>
+        <w:pStyle w:val="Listing"/>
+      </w:pPr>
+    </w:p>
+    <w:p>
+      <w:pPr>
+        <w:pStyle w:val="Listing"/>
+      </w:pPr>
+      <w:r>
+        <w:t xml:space="preserve">    public void SubscribeAll()</w:t>
+      </w:r>
+    </w:p>
+    <w:p>
+      <w:pPr>
+        <w:pStyle w:val="Listing"/>
+      </w:pPr>
+      <w:r>
+        <w:t xml:space="preserve">    {</w:t>
+      </w:r>
+    </w:p>
+    <w:p>
+      <w:pPr>
+        <w:pStyle w:val="Listing"/>
+      </w:pPr>
+      <w:r>
+        <w:t xml:space="preserve">        for (int i = 0; i &lt; 1000; i++)</w:t>
+      </w:r>
+    </w:p>
+    <w:p>
+      <w:pPr>
+        <w:pStyle w:val="Listing"/>
+      </w:pPr>
+      <w:r>
+        <w:t xml:space="preserve">        {</w:t>
+      </w:r>
+    </w:p>
+    <w:p>
+      <w:pPr>
+        <w:pStyle w:val="Listing"/>
+      </w:pPr>
+      <w:r>
+        <w:t xml:space="preserve">            new BuggyCode();                  // Утечка 3: _data (1MB) каждого объекта удерживается через событие</w:t>
+      </w:r>
+    </w:p>
+    <w:p>
+      <w:pPr>
+        <w:pStyle w:val="Listing"/>
+      </w:pPr>
+      <w:r>
+        <w:t xml:space="preserve">        }</w:t>
+      </w:r>
+    </w:p>
+    <w:p>
+      <w:pPr>
+        <w:pStyle w:val="Listing"/>
+      </w:pPr>
+      <w:r>
+        <w:t xml:space="preserve">    }</w:t>
+      </w:r>
+    </w:p>
+    <w:p>
+      <w:pPr>
+        <w:pStyle w:val="Listing"/>
+      </w:pPr>
+    </w:p>
+    <w:p>
+      <w:pPr>
+        <w:pStyle w:val="Listing"/>
+      </w:pPr>
+      <w:r>
+        <w:t xml:space="preserve">    public static int CacheCount =&gt; _cache.Count;</w:t>
+      </w:r>
+    </w:p>
+    <w:p>
+      <w:pPr>
+        <w:pStyle w:val="Listing"/>
+      </w:pPr>
+      <w:r>
+        <w:t>}</w:t>
+      </w:r>
+    </w:p>
+    <w:p>
+      <w:pPr>
+        <w:pStyle w:val="Listing"/>
+      </w:pPr>
+    </w:p>
+    <w:p>
+      <w:pPr>
+        <w:pStyle w:val="Listing"/>
+      </w:pPr>
+      <w:r>
+        <w:t>public class FixedCode : IDisposable</w:t>
+      </w:r>
+    </w:p>
+    <w:p>
+      <w:pPr>
+        <w:pStyle w:val="Listing"/>
+      </w:pPr>
+      <w:r>
+        <w:t>{</w:t>
+      </w:r>
+    </w:p>
+    <w:p>
+      <w:pPr>
+        <w:pStyle w:val="Listing"/>
+      </w:pPr>
+      <w:r>
+        <w:t xml:space="preserve">    private static List&lt;IDisposable&gt; _cache = new List&lt;IDisposable&gt;();</w:t>
+      </w:r>
+    </w:p>
+    <w:p>
+      <w:pPr>
+        <w:pStyle w:val="Listing"/>
+      </w:pPr>
+      <w:r>
+        <w:t xml:space="preserve">    private static event EventHandler? _globalEvent;</w:t>
+      </w:r>
+    </w:p>
+    <w:p>
+      <w:pPr>
+        <w:pStyle w:val="Listing"/>
+      </w:pPr>
+      <w:r>
+        <w:t xml:space="preserve">    private byte[]? _data = new byte[1024 * 1024];</w:t>
+      </w:r>
+    </w:p>
+    <w:p>
+      <w:pPr>
+        <w:pStyle w:val="Listing"/>
+      </w:pPr>
+      <w:r>
+        <w:t xml:space="preserve">    private MemoryStream _stream = new MemoryStream(1024);</w:t>
+      </w:r>
+    </w:p>
+    <w:p>
+      <w:pPr>
+        <w:pStyle w:val="Listing"/>
+      </w:pPr>
+    </w:p>
+    <w:p>
+      <w:pPr>
+        <w:pStyle w:val="Listing"/>
+      </w:pPr>
+      <w:r>
+        <w:t xml:space="preserve">    public FixedCode()</w:t>
+      </w:r>
+    </w:p>
+    <w:p>
+      <w:pPr>
+        <w:pStyle w:val="Listing"/>
+      </w:pPr>
+      <w:r>
+        <w:t xml:space="preserve">    {</w:t>
+      </w:r>
+    </w:p>
+    <w:p>
+      <w:pPr>
+        <w:pStyle w:val="Listing"/>
+      </w:pPr>
+      <w:r>
+        <w:t xml:space="preserve">        _globalEvent += OnEvent;</w:t>
+      </w:r>
+    </w:p>
+    <w:p>
+      <w:pPr>
+        <w:pStyle w:val="Listing"/>
+      </w:pPr>
+      <w:r>
+        <w:t xml:space="preserve">        _cache.Add(_stream);</w:t>
+      </w:r>
+    </w:p>
+    <w:p>
+      <w:pPr>
+        <w:pStyle w:val="Listing"/>
+      </w:pPr>
+      <w:r>
+        <w:t xml:space="preserve">    }</w:t>
+      </w:r>
+    </w:p>
+    <w:p>
+      <w:pPr>
+        <w:pStyle w:val="Listing"/>
+      </w:pPr>
+    </w:p>
+    <w:p>
+      <w:pPr>
+        <w:pStyle w:val="Listing"/>
+      </w:pPr>
+      <w:r>
+        <w:t xml:space="preserve">    private void OnEvent(object? sender, EventArgs e)</w:t>
+      </w:r>
+    </w:p>
+    <w:p>
+      <w:pPr>
+        <w:pStyle w:val="Listing"/>
+      </w:pPr>
+      <w:r>
+        <w:t xml:space="preserve">    {</w:t>
+      </w:r>
+    </w:p>
+    <w:p>
+      <w:pPr>
+        <w:pStyle w:val="Listing"/>
+      </w:pPr>
+      <w:r>
         <w:t xml:space="preserve">        var temp = new byte[1024 * 100];</w:t>
       </w:r>
     </w:p>
     <w:p>
       <w:pPr>
-        <w:spacing w:line="240" w:lineRule="auto"/>
-      </w:pPr>
-      <w:r>
-        <w:rPr>
-          <w:i/>
-          <w:sz w:val="24"/>
-        </w:rPr>
+        <w:pStyle w:val="Listing"/>
+      </w:pPr>
+      <w:r>
         <w:t xml:space="preserve">    }</w:t>
       </w:r>
     </w:p>
     <w:p>
       <w:pPr>
-        <w:spacing w:line="240" w:lineRule="auto"/>
-      </w:pPr>
-    </w:p>
-    <w:p>
-      <w:pPr>
-        <w:spacing w:line="240" w:lineRule="auto"/>
-      </w:pPr>
-      <w:r>
-        <w:rPr>
-          <w:i/>
-          <w:sz w:val="24"/>
-        </w:rPr>
+        <w:pStyle w:val="Listing"/>
+      </w:pPr>
+    </w:p>
+    <w:p>
+      <w:pPr>
+        <w:pStyle w:val="Listing"/>
+      </w:pPr>
+      <w:r>
         <w:t xml:space="preserve">    public void SubscribeAll()</w:t>
       </w:r>
     </w:p>
     <w:p>
       <w:pPr>
-        <w:spacing w:line="240" w:lineRule="auto"/>
-      </w:pPr>
-      <w:r>
-        <w:rPr>
-          <w:i/>
-          <w:sz w:val="24"/>
-        </w:rPr>
+        <w:pStyle w:val="Listing"/>
+      </w:pPr>
+      <w:r>
         <w:t xml:space="preserve">    {</w:t>
       </w:r>
     </w:p>
     <w:p>
       <w:pPr>
-        <w:spacing w:line="240" w:lineRule="auto"/>
-      </w:pPr>
-      <w:r>
-        <w:rPr>
-          <w:i/>
-          <w:sz w:val="24"/>
-        </w:rPr>
+        <w:pStyle w:val="Listing"/>
+      </w:pPr>
+      <w:r>
         <w:t xml:space="preserve">        for (int i = 0; i &lt; 1000; i++)</w:t>
       </w:r>
     </w:p>
     <w:p>
       <w:pPr>
-        <w:spacing w:line="240" w:lineRule="auto"/>
-      </w:pPr>
-      <w:r>
-        <w:rPr>
-          <w:i/>
-          <w:sz w:val="24"/>
-        </w:rPr>
+        <w:pStyle w:val="Listing"/>
+      </w:pPr>
+      <w:r>
         <w:t xml:space="preserve">        {</w:t>
       </w:r>
     </w:p>
     <w:p>
       <w:pPr>
-        <w:spacing w:line="240" w:lineRule="auto"/>
-      </w:pPr>
-      <w:r>
-        <w:rPr>
-          <w:i/>
-          <w:sz w:val="24"/>
-        </w:rPr>
-        <w:t xml:space="preserve">            new BuggyCode();                  // Утечка 3: _data (1MB) каждого объекта удерживается через событие</w:t>
-      </w:r>
-    </w:p>
-    <w:p>
-      <w:pPr>
-        <w:spacing w:line="240" w:lineRule="auto"/>
-      </w:pPr>
-      <w:r>
-        <w:rPr>
-          <w:i/>
-          <w:sz w:val="24"/>
-        </w:rPr>
+        <w:pStyle w:val="Listing"/>
+      </w:pPr>
+      <w:r>
+        <w:t xml:space="preserve">            using (new FixedCode())           // объект освобождается сразу после использования</w:t>
+      </w:r>
+    </w:p>
+    <w:p>
+      <w:pPr>
+        <w:pStyle w:val="Listing"/>
+      </w:pPr>
+      <w:r>
+        <w:t xml:space="preserve">            {</w:t>
+      </w:r>
+    </w:p>
+    <w:p>
+      <w:pPr>
+        <w:pStyle w:val="Listing"/>
+      </w:pPr>
+      <w:r>
+        <w:t xml:space="preserve">            }</w:t>
+      </w:r>
+    </w:p>
+    <w:p>
+      <w:pPr>
+        <w:pStyle w:val="Listing"/>
+      </w:pPr>
+      <w:r>
         <w:t xml:space="preserve">        }</w:t>
       </w:r>
     </w:p>
     <w:p>
       <w:pPr>
-        <w:spacing w:line="240" w:lineRule="auto"/>
-      </w:pPr>
-      <w:r>
-        <w:rPr>
-          <w:i/>
-          <w:sz w:val="24"/>
-        </w:rPr>
+        <w:pStyle w:val="Listing"/>
+      </w:pPr>
+      <w:r>
         <w:t xml:space="preserve">    }</w:t>
       </w:r>
     </w:p>
     <w:p>
       <w:pPr>
-        <w:spacing w:line="240" w:lineRule="auto"/>
-      </w:pPr>
-    </w:p>
-    <w:p>
-      <w:pPr>
-        <w:spacing w:line="240" w:lineRule="auto"/>
-      </w:pPr>
-      <w:r>
-        <w:rPr>
-          <w:i/>
-          <w:sz w:val="24"/>
-        </w:rPr>
+        <w:pStyle w:val="Listing"/>
+      </w:pPr>
+    </w:p>
+    <w:p>
+      <w:pPr>
+        <w:pStyle w:val="Listing"/>
+      </w:pPr>
+      <w:r>
+        <w:t xml:space="preserve">    public void Dispose()</w:t>
+      </w:r>
+    </w:p>
+    <w:p>
+      <w:pPr>
+        <w:pStyle w:val="Listing"/>
+      </w:pPr>
+      <w:r>
+        <w:t xml:space="preserve">    {</w:t>
+      </w:r>
+    </w:p>
+    <w:p>
+      <w:pPr>
+        <w:pStyle w:val="Listing"/>
+      </w:pPr>
+      <w:r>
+        <w:t xml:space="preserve">        _globalEvent -= OnEvent;              // отписка от события</w:t>
+      </w:r>
+    </w:p>
+    <w:p>
+      <w:pPr>
+        <w:pStyle w:val="Listing"/>
+      </w:pPr>
+      <w:r>
+        <w:t xml:space="preserve">        _cache.Remove(_stream);               // удаление из статического кэша</w:t>
+      </w:r>
+    </w:p>
+    <w:p>
+      <w:pPr>
+        <w:pStyle w:val="Listing"/>
+      </w:pPr>
+      <w:r>
+        <w:t xml:space="preserve">        _stream.Dispose();                    // освобождение потока</w:t>
+      </w:r>
+    </w:p>
+    <w:p>
+      <w:pPr>
+        <w:pStyle w:val="Listing"/>
+      </w:pPr>
+      <w:r>
+        <w:t xml:space="preserve">        _data = null;</w:t>
+      </w:r>
+    </w:p>
+    <w:p>
+      <w:pPr>
+        <w:pStyle w:val="Listing"/>
+      </w:pPr>
+      <w:r>
+        <w:t xml:space="preserve">    }</w:t>
+      </w:r>
+    </w:p>
+    <w:p>
+      <w:pPr>
+        <w:pStyle w:val="Listing"/>
+      </w:pPr>
+    </w:p>
+    <w:p>
+      <w:pPr>
+        <w:pStyle w:val="Listing"/>
+      </w:pPr>
+      <w:r>
         <w:t xml:space="preserve">    public static int CacheCount =&gt; _cache.Count;</w:t>
       </w:r>
     </w:p>
     <w:p>
       <w:pPr>
-        <w:spacing w:line="240" w:lineRule="auto"/>
-      </w:pPr>
-      <w:r>
-        <w:rPr>
-          <w:i/>
-          <w:sz w:val="24"/>
-        </w:rPr>
-        <w:t>}</w:t>
-      </w:r>
-    </w:p>
-    <w:p>
-      <w:pPr>
-        <w:spacing w:line="240" w:lineRule="auto"/>
-      </w:pPr>
-    </w:p>
-    <w:p>
-      <w:pPr>
-        <w:spacing w:line="240" w:lineRule="auto"/>
-      </w:pPr>
-      <w:r>
-        <w:rPr>
-          <w:i/>
-          <w:sz w:val="24"/>
-        </w:rPr>
-        <w:t xml:space="preserve">public class FixedCode : </w:t>
-      </w:r>
-      <w:r>
-        <w:rPr>
-          <w:i/>
-          <w:sz w:val="24"/>
-        </w:rPr>
-        <w:t>IDisposable</w:t>
-      </w:r>
-    </w:p>
-    <w:p>
-      <w:pPr>
-        <w:spacing w:line="240" w:lineRule="auto"/>
-      </w:pPr>
-      <w:r>
-        <w:rPr>
-          <w:i/>
-          <w:sz w:val="24"/>
-        </w:rPr>
-        <w:t>{</w:t>
-      </w:r>
-    </w:p>
-    <w:p>
-      <w:pPr>
-        <w:spacing w:line="240" w:lineRule="auto"/>
-      </w:pPr>
-      <w:r>
-        <w:rPr>
-          <w:i/>
-          <w:sz w:val="24"/>
-        </w:rPr>
-        <w:t xml:space="preserve">    private static List&lt;IDisposable&gt; _cache = new List&lt;IDisposable&gt;();</w:t>
-      </w:r>
-    </w:p>
-    <w:p>
-      <w:pPr>
-        <w:spacing w:line="240" w:lineRule="auto"/>
-      </w:pPr>
-      <w:r>
-        <w:rPr>
-          <w:i/>
-          <w:sz w:val="24"/>
-        </w:rPr>
-        <w:t xml:space="preserve">    private static event EventHandler? _globalEvent;</w:t>
-      </w:r>
-    </w:p>
-    <w:p>
-      <w:pPr>
-        <w:spacing w:line="240" w:lineRule="auto"/>
-      </w:pPr>
-      <w:r>
-        <w:rPr>
-          <w:i/>
-          <w:sz w:val="24"/>
-        </w:rPr>
-        <w:t xml:space="preserve">    private byte[]? _data = new byte[1024 * 1024];</w:t>
-      </w:r>
-    </w:p>
-    <w:p>
-      <w:pPr>
-        <w:spacing w:line="240" w:lineRule="auto"/>
-      </w:pPr>
-      <w:r>
-        <w:rPr>
-          <w:i/>
-          <w:sz w:val="24"/>
-        </w:rPr>
-        <w:t xml:space="preserve">    private MemoryStream _stream = new MemoryStream(1024);</w:t>
-      </w:r>
-    </w:p>
-    <w:p>
-      <w:pPr>
-        <w:spacing w:line="240" w:lineRule="auto"/>
-      </w:pPr>
-    </w:p>
-    <w:p>
-      <w:pPr>
-        <w:spacing w:line="240" w:lineRule="auto"/>
-      </w:pPr>
-      <w:r>
-        <w:rPr>
-          <w:i/>
-          <w:sz w:val="24"/>
-        </w:rPr>
-        <w:t xml:space="preserve">    public FixedCode()</w:t>
-      </w:r>
-    </w:p>
-    <w:p>
-      <w:pPr>
-        <w:spacing w:line="240" w:lineRule="auto"/>
-      </w:pPr>
-      <w:r>
-        <w:rPr>
-          <w:i/>
-          <w:sz w:val="24"/>
-        </w:rPr>
-        <w:t xml:space="preserve">    {</w:t>
-      </w:r>
-    </w:p>
-    <w:p>
-      <w:pPr>
-        <w:spacing w:line="240" w:lineRule="auto"/>
-      </w:pPr>
-      <w:r>
-        <w:rPr>
-          <w:i/>
-          <w:sz w:val="24"/>
-        </w:rPr>
-        <w:t xml:space="preserve">        _globalEvent += OnEvent;</w:t>
-      </w:r>
-    </w:p>
-    <w:p>
-      <w:pPr>
-        <w:spacing w:line="240" w:lineRule="auto"/>
-      </w:pPr>
-      <w:r>
-        <w:rPr>
-          <w:i/>
-          <w:sz w:val="24"/>
-        </w:rPr>
-        <w:t xml:space="preserve">        _cache.Add(_stream);</w:t>
-      </w:r>
-    </w:p>
-    <w:p>
-      <w:pPr>
-        <w:spacing w:line="240" w:lineRule="auto"/>
-      </w:pPr>
-      <w:r>
-        <w:rPr>
-          <w:i/>
-          <w:sz w:val="24"/>
-        </w:rPr>
-        <w:t xml:space="preserve">    }</w:t>
-      </w:r>
-    </w:p>
-    <w:p>
-      <w:pPr>
-        <w:spacing w:line="240" w:lineRule="auto"/>
-      </w:pPr>
-    </w:p>
-    <w:p>
-      <w:pPr>
-        <w:spacing w:line="240" w:lineRule="auto"/>
-      </w:pPr>
-      <w:r>
-        <w:rPr>
-          <w:i/>
-          <w:sz w:val="24"/>
-        </w:rPr>
-        <w:t xml:space="preserve">    private void OnEvent(object? sender, EventArgs e)</w:t>
-      </w:r>
-    </w:p>
-    <w:p>
-      <w:pPr>
-        <w:spacing w:line="240" w:lineRule="auto"/>
-      </w:pPr>
-      <w:r>
-        <w:rPr>
-          <w:i/>
-          <w:sz w:val="24"/>
-        </w:rPr>
-        <w:t xml:space="preserve">    {</w:t>
-      </w:r>
-    </w:p>
-    <w:p>
-      <w:pPr>
-        <w:spacing w:line="240" w:lineRule="auto"/>
-      </w:pPr>
-      <w:r>
-        <w:rPr>
-          <w:i/>
-          <w:sz w:val="24"/>
-        </w:rPr>
-        <w:t xml:space="preserve">        var temp = new byte[1024 * 100];</w:t>
-      </w:r>
-    </w:p>
-    <w:p>
-      <w:pPr>
-        <w:spacing w:line="240" w:lineRule="auto"/>
-      </w:pPr>
-      <w:r>
-        <w:rPr>
-          <w:i/>
-          <w:sz w:val="24"/>
-        </w:rPr>
-        <w:t xml:space="preserve">    }</w:t>
-      </w:r>
-    </w:p>
-    <w:p>
-      <w:pPr>
-        <w:spacing w:line="240" w:lineRule="auto"/>
-      </w:pPr>
-    </w:p>
-    <w:p>
-      <w:pPr>
-        <w:spacing w:line="240" w:lineRule="auto"/>
-      </w:pPr>
-      <w:r>
-        <w:rPr>
-          <w:i/>
-          <w:sz w:val="24"/>
-        </w:rPr>
-        <w:t xml:space="preserve">    public void SubscribeAll()</w:t>
-      </w:r>
-    </w:p>
-    <w:p>
-      <w:pPr>
-        <w:spacing w:line="240" w:lineRule="auto"/>
-      </w:pPr>
-      <w:r>
-        <w:rPr>
-          <w:i/>
-          <w:sz w:val="24"/>
-        </w:rPr>
-        <w:t xml:space="preserve">    {</w:t>
-      </w:r>
-    </w:p>
-    <w:p>
-      <w:pPr>
-        <w:spacing w:line="240" w:lineRule="auto"/>
-      </w:pPr>
-      <w:r>
-        <w:rPr>
-          <w:i/>
-          <w:sz w:val="24"/>
-        </w:rPr>
-        <w:t xml:space="preserve">        for (int i</w:t>
-      </w:r>
-      <w:r>
-        <w:rPr>
-          <w:i/>
-          <w:sz w:val="24"/>
-        </w:rPr>
-        <w:t xml:space="preserve"> = 0; i &lt; 1000; i++)</w:t>
-      </w:r>
-    </w:p>
-    <w:p>
-      <w:pPr>
-        <w:spacing w:line="240" w:lineRule="auto"/>
-      </w:pPr>
-      <w:r>
-        <w:rPr>
-          <w:i/>
-          <w:sz w:val="24"/>
-        </w:rPr>
-        <w:t xml:space="preserve">        {</w:t>
-      </w:r>
-    </w:p>
-    <w:p>
-      <w:pPr>
-        <w:spacing w:line="240" w:lineRule="auto"/>
-      </w:pPr>
-      <w:r>
-        <w:rPr>
-          <w:i/>
-          <w:sz w:val="24"/>
-        </w:rPr>
-        <w:t xml:space="preserve">            using (new FixedCode())           // объект освобождается сразу после использования</w:t>
-      </w:r>
-    </w:p>
-    <w:p>
-      <w:pPr>
-        <w:spacing w:line="240" w:lineRule="auto"/>
-      </w:pPr>
-      <w:r>
-        <w:rPr>
-          <w:i/>
-          <w:sz w:val="24"/>
-        </w:rPr>
-        <w:t xml:space="preserve">            {</w:t>
-      </w:r>
-    </w:p>
-    <w:p>
-      <w:pPr>
-        <w:spacing w:line="240" w:lineRule="auto"/>
-      </w:pPr>
-      <w:r>
-        <w:rPr>
-          <w:i/>
-          <w:sz w:val="24"/>
-        </w:rPr>
-        <w:t xml:space="preserve">            }</w:t>
-      </w:r>
-    </w:p>
-    <w:p>
-      <w:pPr>
-        <w:spacing w:line="240" w:lineRule="auto"/>
-      </w:pPr>
-      <w:r>
-        <w:rPr>
-          <w:i/>
-          <w:sz w:val="24"/>
-        </w:rPr>
-        <w:t xml:space="preserve">        }</w:t>
-      </w:r>
-    </w:p>
-    <w:p>
-      <w:pPr>
-        <w:spacing w:line="240" w:lineRule="auto"/>
-      </w:pPr>
-      <w:r>
-        <w:rPr>
-          <w:i/>
-          <w:sz w:val="24"/>
-        </w:rPr>
-        <w:t xml:space="preserve">    }</w:t>
-      </w:r>
-    </w:p>
-    <w:p>
-      <w:pPr>
-        <w:spacing w:line="240" w:lineRule="auto"/>
-      </w:pPr>
-    </w:p>
-    <w:p>
-      <w:pPr>
-        <w:spacing w:line="240" w:lineRule="auto"/>
-      </w:pPr>
-      <w:r>
-        <w:rPr>
-          <w:i/>
-          <w:sz w:val="24"/>
-        </w:rPr>
-        <w:t xml:space="preserve">    public void Dispose()</w:t>
-      </w:r>
-    </w:p>
-    <w:p>
-      <w:pPr>
-        <w:spacing w:line="240" w:lineRule="auto"/>
-      </w:pPr>
-      <w:r>
-        <w:rPr>
-          <w:i/>
-          <w:sz w:val="24"/>
-        </w:rPr>
-        <w:t xml:space="preserve">    {</w:t>
-      </w:r>
-    </w:p>
-    <w:p>
-      <w:pPr>
-        <w:spacing w:line="240" w:lineRule="auto"/>
-      </w:pPr>
-      <w:r>
-        <w:rPr>
-          <w:i/>
-          <w:sz w:val="24"/>
-        </w:rPr>
-        <w:t xml:space="preserve">        _globalEvent -= OnEvent;              // отписка от события</w:t>
-      </w:r>
-    </w:p>
-    <w:p>
-      <w:pPr>
-        <w:spacing w:line="240" w:lineRule="auto"/>
-      </w:pPr>
-      <w:r>
-        <w:rPr>
-          <w:i/>
-          <w:sz w:val="24"/>
-        </w:rPr>
-        <w:t xml:space="preserve">        _cache.Remove(_stream);               // удаление из статического кэша</w:t>
-      </w:r>
-    </w:p>
-    <w:p>
-      <w:pPr>
-        <w:spacing w:line="240" w:lineRule="auto"/>
-      </w:pPr>
-      <w:r>
-        <w:rPr>
-          <w:i/>
-          <w:sz w:val="24"/>
-        </w:rPr>
-        <w:t xml:space="preserve">        _stream.Dispose();                    // освобождение потока</w:t>
-      </w:r>
-    </w:p>
-    <w:p>
-      <w:pPr>
-        <w:spacing w:line="240" w:lineRule="auto"/>
-      </w:pPr>
-      <w:r>
-        <w:rPr>
-          <w:i/>
-          <w:sz w:val="24"/>
-        </w:rPr>
-        <w:t xml:space="preserve">        _data = null;</w:t>
-      </w:r>
-    </w:p>
-    <w:p>
-      <w:pPr>
-        <w:spacing w:line="240" w:lineRule="auto"/>
-      </w:pPr>
-      <w:r>
-        <w:rPr>
-          <w:i/>
-          <w:sz w:val="24"/>
-        </w:rPr>
-        <w:t xml:space="preserve">    }</w:t>
-      </w:r>
-    </w:p>
-    <w:p>
-      <w:pPr>
-        <w:spacing w:line="240" w:lineRule="auto"/>
-      </w:pPr>
-    </w:p>
-    <w:p>
-      <w:pPr>
-        <w:spacing w:line="240" w:lineRule="auto"/>
-      </w:pPr>
-      <w:r>
-        <w:rPr>
-          <w:i/>
-          <w:sz w:val="24"/>
-        </w:rPr>
-        <w:lastRenderedPageBreak/>
-        <w:t xml:space="preserve">    public static int CacheCount =&gt; _cache.Count;</w:t>
-      </w:r>
-    </w:p>
-    <w:p>
-      <w:pPr>
-        <w:spacing w:line="240" w:lineRule="auto"/>
-      </w:pPr>
-      <w:r>
-        <w:rPr>
-          <w:i/>
-          <w:sz w:val="24"/>
-        </w:rPr>
+        <w:pStyle w:val="Listing"/>
+      </w:pPr>
+      <w:r>
         <w:t>}</w:t>
       </w:r>
     </w:p>
@@ -7484,7 +6607,7 @@
           <w:noProof/>
         </w:rPr>
         <w:drawing>
-          <wp:inline distT="0" distB="0" distL="0" distR="0" wp14:anchorId="7A53BCB3" wp14:editId="797B1663">
+          <wp:inline distT="0" distB="0" distL="0" distR="0" wp14:anchorId="5E3F3173" wp14:editId="3958DE6C">
             <wp:extent cx="5580000" cy="1646913"/>
             <wp:effectExtent l="0" t="0" r="0" b="0"/>
             <wp:docPr id="11" name="Picture 11"/>
@@ -7576,7 +6699,7 @@
         <w:pStyle w:val="1"/>
         <w:ind w:firstLine="709"/>
       </w:pPr>
-      <w:bookmarkStart w:id="12" w:name="_Toc242378573"/>
+      <w:bookmarkStart w:id="12" w:name="_Toc242385954"/>
       <w:r>
         <w:rPr>
           <w:rFonts w:ascii="Times New Roman" w:hAnsi="Times New Roman"/>
@@ -7592,7 +6715,7 @@
         <w:spacing w:before="360"/>
         <w:ind w:firstLine="709"/>
       </w:pPr>
-      <w:bookmarkStart w:id="13" w:name="_Toc242378574"/>
+      <w:bookmarkStart w:id="13" w:name="_Toc242385955"/>
       <w:r>
         <w:rPr>
           <w:rFonts w:ascii="Times New Roman" w:hAnsi="Times New Roman"/>
@@ -7616,7 +6739,7 @@
         <w:spacing w:before="360"/>
         <w:ind w:firstLine="709"/>
       </w:pPr>
-      <w:bookmarkStart w:id="14" w:name="_Toc242378575"/>
+      <w:bookmarkStart w:id="14" w:name="_Toc242385956"/>
       <w:r>
         <w:rPr>
           <w:rFonts w:ascii="Times New Roman" w:hAnsi="Times New Roman"/>
@@ -7676,7 +6799,7 @@
         <w:spacing w:before="360"/>
         <w:ind w:firstLine="709"/>
       </w:pPr>
-      <w:bookmarkStart w:id="15" w:name="_Toc242378576"/>
+      <w:bookmarkStart w:id="15" w:name="_Toc242385957"/>
       <w:r>
         <w:rPr>
           <w:rFonts w:ascii="Times New Roman" w:hAnsi="Times New Roman"/>
@@ -7736,7 +6859,7 @@
         <w:spacing w:before="360"/>
         <w:ind w:firstLine="709"/>
       </w:pPr>
-      <w:bookmarkStart w:id="16" w:name="_Toc242378577"/>
+      <w:bookmarkStart w:id="16" w:name="_Toc242385958"/>
       <w:r>
         <w:rPr>
           <w:rFonts w:ascii="Times New Roman" w:hAnsi="Times New Roman"/>
@@ -7760,7 +6883,7 @@
         <w:spacing w:before="360"/>
         <w:ind w:firstLine="709"/>
       </w:pPr>
-      <w:bookmarkStart w:id="17" w:name="_Toc242378578"/>
+      <w:bookmarkStart w:id="17" w:name="_Toc242385959"/>
       <w:r>
         <w:rPr>
           <w:rFonts w:ascii="Times New Roman" w:hAnsi="Times New Roman"/>
@@ -7804,7 +6927,7 @@
         <w:spacing w:before="360"/>
         <w:ind w:firstLine="709"/>
       </w:pPr>
-      <w:bookmarkStart w:id="18" w:name="_Toc242378579"/>
+      <w:bookmarkStart w:id="18" w:name="_Toc242385960"/>
       <w:r>
         <w:rPr>
           <w:rFonts w:ascii="Times New Roman" w:hAnsi="Times New Roman"/>
@@ -7879,7 +7002,7 @@
         <w:spacing w:before="360"/>
         <w:ind w:firstLine="709"/>
       </w:pPr>
-      <w:bookmarkStart w:id="19" w:name="_Toc242378580"/>
+      <w:bookmarkStart w:id="19" w:name="_Toc242385961"/>
       <w:r>
         <w:rPr>
           <w:rFonts w:ascii="Times New Roman" w:hAnsi="Times New Roman"/>
@@ -7971,7 +7094,7 @@
         <w:pStyle w:val="1"/>
         <w:jc w:val="center"/>
       </w:pPr>
-      <w:bookmarkStart w:id="20" w:name="_Toc242378581"/>
+      <w:bookmarkStart w:id="20" w:name="_Toc242385962"/>
       <w:r>
         <w:rPr>
           <w:rFonts w:ascii="Times New Roman" w:hAnsi="Times New Roman"/>
@@ -8041,7 +7164,7 @@
         <w:t>dotnet-gcdump</w:t>
       </w:r>
       <w:r>
-        <w:t xml:space="preserve">, подтвердили рост и последующее уменьшение управляемой кучи. Устранение упаковки сократило время добавления миллиона элементов со 170 до 9 мс. Найдены и исправлены утечки в классе </w:t>
+        <w:t xml:space="preserve">, подтвердили рост и последующее уменьшение управляемой кучи. Устранение упаковки сократило время добавления миллиона элементов с 84 до 4 мс. Найдены и исправлены утечки в классе </w:t>
       </w:r>
       <w:r>
         <w:rPr>
@@ -8324,31 +7447,31 @@
       </w:rPr>
     </w:lvl>
   </w:abstractNum>
-  <w:num w:numId="1" w16cid:durableId="952246954">
+  <w:num w:numId="1" w16cid:durableId="1174564788">
     <w:abstractNumId w:val="8"/>
   </w:num>
-  <w:num w:numId="2" w16cid:durableId="672073594">
+  <w:num w:numId="2" w16cid:durableId="384571776">
     <w:abstractNumId w:val="6"/>
   </w:num>
-  <w:num w:numId="3" w16cid:durableId="827785888">
+  <w:num w:numId="3" w16cid:durableId="179902965">
     <w:abstractNumId w:val="5"/>
   </w:num>
-  <w:num w:numId="4" w16cid:durableId="1519352237">
+  <w:num w:numId="4" w16cid:durableId="1591546790">
     <w:abstractNumId w:val="4"/>
   </w:num>
-  <w:num w:numId="5" w16cid:durableId="185600460">
+  <w:num w:numId="5" w16cid:durableId="971715299">
     <w:abstractNumId w:val="7"/>
   </w:num>
-  <w:num w:numId="6" w16cid:durableId="1315262798">
+  <w:num w:numId="6" w16cid:durableId="860820183">
     <w:abstractNumId w:val="3"/>
   </w:num>
-  <w:num w:numId="7" w16cid:durableId="1873761657">
+  <w:num w:numId="7" w16cid:durableId="575431863">
     <w:abstractNumId w:val="2"/>
   </w:num>
-  <w:num w:numId="8" w16cid:durableId="176893408">
+  <w:num w:numId="8" w16cid:durableId="1139759235">
     <w:abstractNumId w:val="1"/>
   </w:num>
-  <w:num w:numId="9" w16cid:durableId="892808688">
+  <w:num w:numId="9" w16cid:durableId="1609703782">
     <w:abstractNumId w:val="0"/>
   </w:num>
 </w:numbering>
@@ -19736,6 +18859,17 @@
       </w:tcPr>
     </w:tblStylePr>
   </w:style>
+  <w:style w:type="paragraph" w:customStyle="1" w:styleId="Listing">
+    <w:name w:val="Listing"/>
+    <w:basedOn w:val="a1"/>
+    <w:pPr>
+      <w:spacing w:line="240" w:lineRule="auto"/>
+    </w:pPr>
+    <w:rPr>
+      <w:i/>
+      <w:sz w:val="24"/>
+    </w:rPr>
+  </w:style>
   <w:style w:type="paragraph" w:styleId="14">
     <w:name w:val="toc 1"/>
     <w:basedOn w:val="a1"/>
@@ -19743,7 +18877,7 @@
     <w:autoRedefine/>
     <w:uiPriority w:val="39"/>
     <w:unhideWhenUsed/>
-    <w:rsid w:val="005133AD"/>
+    <w:rsid w:val="00380AF5"/>
     <w:pPr>
       <w:spacing w:after="100"/>
     </w:pPr>
@@ -19755,7 +18889,7 @@
     <w:autoRedefine/>
     <w:uiPriority w:val="39"/>
     <w:unhideWhenUsed/>
-    <w:rsid w:val="005133AD"/>
+    <w:rsid w:val="00380AF5"/>
     <w:pPr>
       <w:spacing w:after="100"/>
       <w:ind w:left="280"/>
@@ -19766,7 +18900,7 @@
     <w:basedOn w:val="a2"/>
     <w:uiPriority w:val="99"/>
     <w:unhideWhenUsed/>
-    <w:rsid w:val="005133AD"/>
+    <w:rsid w:val="00380AF5"/>
     <w:rPr>
       <w:color w:val="0000FF" w:themeColor="hyperlink"/>
       <w:u w:val="single"/>

</xml_diff>